<commit_message>
Update Protokol_2_Combined_Template: replace Cyrillic placeholders with Latin names, add Darvesenost/Sastoyanie/Merki_PBZ
</commit_message>
<xml_diff>
--- a/templates/Protokol_2_Combined_Template.docx
+++ b/templates/Protokol_2_Combined_Template.docx
@@ -769,7 +769,7 @@
           <w:sz w:val="24"/>
           <w:szCs w:val="24"/>
         </w:rPr>
-        <w:t>____________________________________</w:t>
+        <w:t>{{Darvesenost}}</w:t>
       </w:r>
     </w:p>
     <w:p>
@@ -847,53 +847,51 @@
           <w:sz w:val="24"/>
           <w:szCs w:val="24"/>
         </w:rPr>
-        <w:t>3.  Описание на строителната площадка:</w:t>
-      </w:r>
-      <w:r>
-        <w:rPr>
-          <w:rFonts w:ascii="Garamond" w:eastAsia="Garamond" w:hAnsi="Garamond" w:cs="Garamond"/>
-          <w:color w:val="1F2937"/>
-          <w:sz w:val="24"/>
-          <w:szCs w:val="24"/>
-        </w:rPr>
-        <w:t>{{Описание_Сграда}}</w:t>
-      </w:r>
-    </w:p>
-    <w:p>
-      <w:pPr>
-        <w:spacing w:before="60" w:after="60"/>
-      </w:pPr>
-      <w:r>
-        <w:rPr>
-          <w:rFonts w:ascii="Garamond" w:eastAsia="Garamond" w:hAnsi="Garamond" w:cs="Garamond"/>
-          <w:color w:val="1F2937"/>
-          <w:sz w:val="24"/>
-          <w:szCs w:val="24"/>
-        </w:rPr>
-        <w:t xml:space="preserve"> </w:t>
-      </w:r>
-      <w:r>
-        <w:rPr>
-          <w:rFonts w:ascii="Garamond" w:eastAsia="Garamond" w:hAnsi="Garamond" w:cs="Garamond"/>
-          <w:color w:val="1F2937"/>
-          <w:sz w:val="24"/>
-          <w:szCs w:val="24"/>
-        </w:rPr>
-        <w:t>4.  Състоянието на околното пространство е: ______________________________________________</w:t>
-      </w:r>
-    </w:p>
-    <w:p>
-      <w:pPr>
-        <w:spacing w:before="60" w:after="60"/>
-      </w:pPr>
-      <w:r>
-        <w:rPr>
-          <w:rFonts w:ascii="Garamond" w:eastAsia="Garamond" w:hAnsi="Garamond" w:cs="Garamond"/>
-          <w:color w:val="1F2937"/>
-          <w:sz w:val="24"/>
-          <w:szCs w:val="24"/>
-        </w:rPr>
-        <w:t>5.  Предвидени мерки по ПБЗ: ______________________________________________</w:t>
+        <w:t>3.  Описание на строителната площадка:{{Opisanie_Ploshtadka}}</w:t>
+      </w:r>
+      <w:r>
+        <w:rPr>
+          <w:rFonts w:ascii="Garamond" w:eastAsia="Garamond" w:hAnsi="Garamond" w:cs="Garamond"/>
+          <w:color w:val="1F2937"/>
+          <w:sz w:val="24"/>
+          <w:szCs w:val="24"/>
+        </w:rPr>
+      </w:r>
+    </w:p>
+    <w:p>
+      <w:pPr>
+        <w:spacing w:before="60" w:after="60"/>
+      </w:pPr>
+      <w:r>
+        <w:rPr>
+          <w:rFonts w:ascii="Garamond" w:eastAsia="Garamond" w:hAnsi="Garamond" w:cs="Garamond"/>
+          <w:color w:val="1F2937"/>
+          <w:sz w:val="24"/>
+          <w:szCs w:val="24"/>
+        </w:rPr>
+        <w:t xml:space="preserve"> 4.  Състоянието на околното пространство е: {{Sastoyanie_Okolo}}</w:t>
+      </w:r>
+      <w:r>
+        <w:rPr>
+          <w:rFonts w:ascii="Garamond" w:eastAsia="Garamond" w:hAnsi="Garamond" w:cs="Garamond"/>
+          <w:color w:val="1F2937"/>
+          <w:sz w:val="24"/>
+          <w:szCs w:val="24"/>
+        </w:rPr>
+      </w:r>
+    </w:p>
+    <w:p>
+      <w:pPr>
+        <w:spacing w:before="60" w:after="60"/>
+      </w:pPr>
+      <w:r>
+        <w:rPr>
+          <w:rFonts w:ascii="Garamond" w:eastAsia="Garamond" w:hAnsi="Garamond" w:cs="Garamond"/>
+          <w:color w:val="1F2937"/>
+          <w:sz w:val="24"/>
+          <w:szCs w:val="24"/>
+        </w:rPr>
+        <w:t>5.  Предвидени мерки по ПБЗ: {{Merki_PBZ}}</w:t>
       </w:r>
     </w:p>
     <w:p/>
@@ -1346,7 +1344,7 @@
           <w:sz w:val="24"/>
           <w:szCs w:val="24"/>
         </w:rPr>
-        <w:t>2.1. Регулационен репер: {{Репер_Номер}} с кота {{Репер_Кота}} м</w:t>
+        <w:t>2.1. Регулационен репер: {{Reper_Nomer}} с кота {{Reper_Kota}} м</w:t>
       </w:r>
     </w:p>
     <w:p/>
@@ -1375,59 +1373,57 @@
           <w:sz w:val="24"/>
           <w:szCs w:val="24"/>
         </w:rPr>
-        <w:t>3.1. Кота изкоп {{Кота_Изкоп}}</w:t>
-      </w:r>
-    </w:p>
-    <w:p>
-      <w:pPr>
-        <w:spacing w:before="60" w:after="60"/>
-      </w:pPr>
-      <w:r>
-        <w:rPr>
-          <w:rFonts w:ascii="Garamond" w:eastAsia="Garamond" w:hAnsi="Garamond" w:cs="Garamond"/>
-          <w:color w:val="1F2937"/>
-          <w:sz w:val="24"/>
-          <w:szCs w:val="24"/>
-        </w:rPr>
-        <w:lastRenderedPageBreak/>
-        <w:t>3.2. Кота цокъл +/-0,00 = {{Кота_Цокъл}}</w:t>
-      </w:r>
-    </w:p>
-    <w:p>
-      <w:pPr>
-        <w:spacing w:before="60" w:after="60"/>
-      </w:pPr>
-      <w:r>
-        <w:rPr>
-          <w:rFonts w:ascii="Garamond" w:eastAsia="Garamond" w:hAnsi="Garamond" w:cs="Garamond"/>
-          <w:color w:val="1F2937"/>
-          <w:sz w:val="24"/>
-          <w:szCs w:val="24"/>
-        </w:rPr>
-        <w:t>3.3. Кота корниз + {{Кота_Корниз}}</w:t>
-      </w:r>
-    </w:p>
-    <w:p>
-      <w:pPr>
-        <w:spacing w:before="60" w:after="60"/>
-      </w:pPr>
-      <w:r>
-        <w:rPr>
-          <w:rFonts w:ascii="Garamond" w:eastAsia="Garamond" w:hAnsi="Garamond" w:cs="Garamond"/>
-          <w:color w:val="1F2937"/>
-          <w:sz w:val="24"/>
-          <w:szCs w:val="24"/>
-        </w:rPr>
-        <w:t xml:space="preserve">3.4. Кота било + </w:t>
-      </w:r>
-      <w:r>
-        <w:rPr>
-          <w:rFonts w:ascii="Garamond" w:eastAsia="Garamond" w:hAnsi="Garamond" w:cs="Garamond"/>
-          <w:color w:val="1F2937"/>
-          <w:sz w:val="24"/>
-          <w:szCs w:val="24"/>
-        </w:rPr>
-        <w:t>{{Кота_Bilo}}</w:t>
+        <w:t>3.1. Кота изкоп {{Kota_Izkop}}</w:t>
+      </w:r>
+    </w:p>
+    <w:p>
+      <w:pPr>
+        <w:spacing w:before="60" w:after="60"/>
+      </w:pPr>
+      <w:r>
+        <w:rPr>
+          <w:rFonts w:ascii="Garamond" w:eastAsia="Garamond" w:hAnsi="Garamond" w:cs="Garamond"/>
+          <w:color w:val="1F2937"/>
+          <w:sz w:val="24"/>
+          <w:szCs w:val="24"/>
+        </w:rPr>
+        <w:t>3.2. Кота цокъл +/-0,00 = {{Kota_Cokul}}</w:t>
+      </w:r>
+    </w:p>
+    <w:p>
+      <w:pPr>
+        <w:spacing w:before="60" w:after="60"/>
+      </w:pPr>
+      <w:r>
+        <w:rPr>
+          <w:rFonts w:ascii="Garamond" w:eastAsia="Garamond" w:hAnsi="Garamond" w:cs="Garamond"/>
+          <w:color w:val="1F2937"/>
+          <w:sz w:val="24"/>
+          <w:szCs w:val="24"/>
+        </w:rPr>
+        <w:t>3.3. Кота корниз + {{Kota_Korniz}}</w:t>
+      </w:r>
+    </w:p>
+    <w:p>
+      <w:pPr>
+        <w:spacing w:before="60" w:after="60"/>
+      </w:pPr>
+      <w:r>
+        <w:rPr>
+          <w:rFonts w:ascii="Garamond" w:eastAsia="Garamond" w:hAnsi="Garamond" w:cs="Garamond"/>
+          <w:color w:val="1F2937"/>
+          <w:sz w:val="24"/>
+          <w:szCs w:val="24"/>
+        </w:rPr>
+        <w:t>3.4. Кота било + {{Kota_Bilo}}</w:t>
+      </w:r>
+      <w:r>
+        <w:rPr>
+          <w:rFonts w:ascii="Garamond" w:eastAsia="Garamond" w:hAnsi="Garamond" w:cs="Garamond"/>
+          <w:color w:val="1F2937"/>
+          <w:sz w:val="24"/>
+          <w:szCs w:val="24"/>
+        </w:rPr>
       </w:r>
     </w:p>
     <w:p>
@@ -1755,7 +1751,7 @@
           <w:sz w:val="24"/>
           <w:szCs w:val="24"/>
         </w:rPr>
-        <w:t>1. Проверка при н</w:t>
+        <w:t>1. Проверка при ниво изкоп, кота {{Kota_Izkop}}</w:t>
       </w:r>
       <w:r>
         <w:rPr>
@@ -1766,7 +1762,6 @@
           <w:sz w:val="24"/>
           <w:szCs w:val="24"/>
         </w:rPr>
-        <w:t>иво изкоп, кота {{Кота_Изкоп}}</w:t>
       </w:r>
     </w:p>
     <w:p>
@@ -1918,25 +1913,23 @@
           <w:sz w:val="24"/>
           <w:szCs w:val="24"/>
         </w:rPr>
-        <w:t xml:space="preserve">след проверка на достигнатото ниво изкоп </w:t>
-      </w:r>
-      <w:r>
-        <w:rPr>
-          <w:rFonts w:ascii="Garamond" w:eastAsia="Garamond" w:hAnsi="Garamond" w:cs="Garamond"/>
-          <w:color w:val="1F2937"/>
-          <w:sz w:val="24"/>
-          <w:szCs w:val="24"/>
-        </w:rPr>
-        <w:t>с проектна кота {{Кота_Изкоп}}</w:t>
-      </w:r>
-      <w:r>
-        <w:rPr>
-          <w:rFonts w:ascii="Garamond" w:eastAsia="Garamond" w:hAnsi="Garamond" w:cs="Garamond"/>
-          <w:color w:val="1F2937"/>
-          <w:sz w:val="24"/>
-          <w:szCs w:val="24"/>
-        </w:rPr>
-        <w:t xml:space="preserve"> установих, че при изпълнението на СМР:</w:t>
+        <w:t>след проверка на достигнатото ниво изкоп с проектна кота {{Kota_Izkop}} установих, че при изпълнението на СМР:</w:t>
+      </w:r>
+      <w:r>
+        <w:rPr>
+          <w:rFonts w:ascii="Garamond" w:eastAsia="Garamond" w:hAnsi="Garamond" w:cs="Garamond"/>
+          <w:color w:val="1F2937"/>
+          <w:sz w:val="24"/>
+          <w:szCs w:val="24"/>
+        </w:rPr>
+      </w:r>
+      <w:r>
+        <w:rPr>
+          <w:rFonts w:ascii="Garamond" w:eastAsia="Garamond" w:hAnsi="Garamond" w:cs="Garamond"/>
+          <w:color w:val="1F2937"/>
+          <w:sz w:val="24"/>
+          <w:szCs w:val="24"/>
+        </w:rPr>
       </w:r>
     </w:p>
     <w:p/>
@@ -2897,7 +2890,7 @@
           <w:sz w:val="24"/>
           <w:szCs w:val="24"/>
         </w:rPr>
-        <w:t xml:space="preserve">3. Проверка при ниво корниз </w:t>
+        <w:t xml:space="preserve">3. Проверка при ниво корниз (стреха), кота {{Kota_Korniz}} </w:t>
       </w:r>
       <w:r>
         <w:rPr>
@@ -2908,7 +2901,6 @@
           <w:sz w:val="24"/>
           <w:szCs w:val="24"/>
         </w:rPr>
-        <w:t xml:space="preserve">(стреха), кота {{Кота_Корниз}} </w:t>
       </w:r>
     </w:p>
     <w:p>
@@ -3048,25 +3040,23 @@
           <w:sz w:val="24"/>
           <w:szCs w:val="24"/>
         </w:rPr>
-        <w:t>след проверка на достигнатото ниво корниз с</w:t>
-      </w:r>
-      <w:r>
-        <w:rPr>
-          <w:rFonts w:ascii="Garamond" w:eastAsia="Garamond" w:hAnsi="Garamond" w:cs="Garamond"/>
-          <w:color w:val="1F2937"/>
-          <w:sz w:val="24"/>
-          <w:szCs w:val="24"/>
-        </w:rPr>
-        <w:t xml:space="preserve"> проектна кота {{Кота_Корниз}} </w:t>
-      </w:r>
-      <w:r>
-        <w:rPr>
-          <w:rFonts w:ascii="Garamond" w:eastAsia="Garamond" w:hAnsi="Garamond" w:cs="Garamond"/>
-          <w:color w:val="1F2937"/>
-          <w:sz w:val="24"/>
-          <w:szCs w:val="24"/>
-        </w:rPr>
-        <w:t xml:space="preserve"> установих, че при изпълнението на СМР:</w:t>
+        <w:t>след проверка на достигнатото ниво корниз с проектна кота {{Kota_Korniz}}  установих, че при изпълнението на СМР:</w:t>
+      </w:r>
+      <w:r>
+        <w:rPr>
+          <w:rFonts w:ascii="Garamond" w:eastAsia="Garamond" w:hAnsi="Garamond" w:cs="Garamond"/>
+          <w:color w:val="1F2937"/>
+          <w:sz w:val="24"/>
+          <w:szCs w:val="24"/>
+        </w:rPr>
+      </w:r>
+      <w:r>
+        <w:rPr>
+          <w:rFonts w:ascii="Garamond" w:eastAsia="Garamond" w:hAnsi="Garamond" w:cs="Garamond"/>
+          <w:color w:val="1F2937"/>
+          <w:sz w:val="24"/>
+          <w:szCs w:val="24"/>
+        </w:rPr>
       </w:r>
     </w:p>
     <w:p/>
@@ -3582,25 +3572,23 @@
           <w:sz w:val="24"/>
           <w:szCs w:val="24"/>
         </w:rPr>
-        <w:t xml:space="preserve">след проверка на достигнатото ниво bilo с </w:t>
-      </w:r>
-      <w:r>
-        <w:rPr>
-          <w:rFonts w:ascii="Garamond" w:eastAsia="Garamond" w:hAnsi="Garamond" w:cs="Garamond"/>
-          <w:color w:val="1F2937"/>
-          <w:sz w:val="24"/>
-          <w:szCs w:val="24"/>
-        </w:rPr>
-        <w:t xml:space="preserve">проектна кота {{Кота_Bilo}} </w:t>
-      </w:r>
-      <w:r>
-        <w:rPr>
-          <w:rFonts w:ascii="Garamond" w:eastAsia="Garamond" w:hAnsi="Garamond" w:cs="Garamond"/>
-          <w:color w:val="1F2937"/>
-          <w:sz w:val="24"/>
-          <w:szCs w:val="24"/>
-        </w:rPr>
-        <w:t xml:space="preserve"> установих, че при изпълнението на СМР:</w:t>
+        <w:t>след проверка на достигнатото ниво bilo с проектна кота {{Kota_Bilo}}  установих, че при изпълнението на СМР:</w:t>
+      </w:r>
+      <w:r>
+        <w:rPr>
+          <w:rFonts w:ascii="Garamond" w:eastAsia="Garamond" w:hAnsi="Garamond" w:cs="Garamond"/>
+          <w:color w:val="1F2937"/>
+          <w:sz w:val="24"/>
+          <w:szCs w:val="24"/>
+        </w:rPr>
+      </w:r>
+      <w:r>
+        <w:rPr>
+          <w:rFonts w:ascii="Garamond" w:eastAsia="Garamond" w:hAnsi="Garamond" w:cs="Garamond"/>
+          <w:color w:val="1F2937"/>
+          <w:sz w:val="24"/>
+          <w:szCs w:val="24"/>
+        </w:rPr>
       </w:r>
     </w:p>
     <w:p/>

</xml_diff>

<commit_message>
Templates: sync Protokol 2 combined edits to repo; ignore Word lock files
Co-Authored-By: Claude Sonnet 4.6 <noreply@anthropic.com>
</commit_message>
<xml_diff>
--- a/templates/Protokol_2_Combined_Template.docx
+++ b/templates/Protokol_2_Combined_Template.docx
@@ -744,12 +744,6 @@
     <w:p>
       <w:pPr>
         <w:spacing w:before="60" w:after="60"/>
-        <w:rPr>
-          <w:rFonts w:ascii="Garamond" w:eastAsia="Garamond" w:hAnsi="Garamond" w:cs="Garamond"/>
-          <w:color w:val="1F2937"/>
-          <w:sz w:val="24"/>
-          <w:szCs w:val="24"/>
-        </w:rPr>
       </w:pPr>
       <w:r>
         <w:rPr>
@@ -760,8 +754,17 @@
         </w:rPr>
         <w:t>1.8. За изкореняване (отсичане) на съществуващи дървета и др.:</w:t>
       </w:r>
-    </w:p>
-    <w:p>
+      <w:r>
+        <w:rPr>
+          <w:rFonts w:ascii="Garamond" w:eastAsia="Garamond" w:hAnsi="Garamond" w:cs="Garamond"/>
+          <w:color w:val="1F2937"/>
+          <w:sz w:val="24"/>
+          <w:szCs w:val="24"/>
+        </w:rPr>
+        <w:t xml:space="preserve"> </w:t>
+      </w:r>
+      <w:bookmarkStart w:id="0" w:name="_GoBack"/>
+      <w:bookmarkEnd w:id="0"/>
       <w:r>
         <w:rPr>
           <w:rFonts w:ascii="Garamond" w:eastAsia="Garamond" w:hAnsi="Garamond" w:cs="Garamond"/>
@@ -783,21 +786,21 @@
           <w:sz w:val="24"/>
           <w:szCs w:val="24"/>
         </w:rPr>
+        <w:t>2.  Изходните точки на външните връзки:</w:t>
+      </w:r>
+    </w:p>
+    <w:p>
+      <w:pPr>
+        <w:spacing w:before="60" w:after="60"/>
+      </w:pPr>
+      <w:r>
+        <w:rPr>
+          <w:rFonts w:ascii="Garamond" w:eastAsia="Garamond" w:hAnsi="Garamond" w:cs="Garamond"/>
+          <w:color w:val="1F2937"/>
+          <w:sz w:val="24"/>
+          <w:szCs w:val="24"/>
+        </w:rPr>
         <w:lastRenderedPageBreak/>
-        <w:t>2.  Изходните точки на външните връзки:</w:t>
-      </w:r>
-    </w:p>
-    <w:p>
-      <w:pPr>
-        <w:spacing w:before="60" w:after="60"/>
-      </w:pPr>
-      <w:r>
-        <w:rPr>
-          <w:rFonts w:ascii="Garamond" w:eastAsia="Garamond" w:hAnsi="Garamond" w:cs="Garamond"/>
-          <w:color w:val="1F2937"/>
-          <w:sz w:val="24"/>
-          <w:szCs w:val="24"/>
-        </w:rPr>
         <w:t>2.1. За временен водопровод: {{Вода}}</w:t>
       </w:r>
     </w:p>
@@ -847,15 +850,56 @@
           <w:sz w:val="24"/>
           <w:szCs w:val="24"/>
         </w:rPr>
-        <w:t>3.  Описание на строителната площадка:{{Opisanie_Ploshtadka}}</w:t>
-      </w:r>
-      <w:r>
-        <w:rPr>
-          <w:rFonts w:ascii="Garamond" w:eastAsia="Garamond" w:hAnsi="Garamond" w:cs="Garamond"/>
-          <w:color w:val="1F2937"/>
-          <w:sz w:val="24"/>
-          <w:szCs w:val="24"/>
-        </w:rPr>
+        <w:t>3</w:t>
+      </w:r>
+      <w:r>
+        <w:rPr>
+          <w:rFonts w:ascii="Garamond" w:eastAsia="Garamond" w:hAnsi="Garamond" w:cs="Garamond"/>
+          <w:b/>
+          <w:bCs/>
+          <w:color w:val="1F2937"/>
+          <w:sz w:val="24"/>
+          <w:szCs w:val="24"/>
+        </w:rPr>
+        <w:t>.   Окомерна скица на имота</w:t>
+      </w:r>
+    </w:p>
+    <w:p>
+      <w:pPr>
+        <w:spacing w:before="60" w:after="60"/>
+        <w:rPr>
+          <w:rFonts w:ascii="Garamond" w:eastAsia="Garamond" w:hAnsi="Garamond" w:cs="Garamond"/>
+          <w:color w:val="1F2937"/>
+          <w:sz w:val="24"/>
+          <w:szCs w:val="24"/>
+        </w:rPr>
+      </w:pPr>
+      <w:r>
+        <w:rPr>
+          <w:rFonts w:ascii="Garamond" w:eastAsia="Garamond" w:hAnsi="Garamond" w:cs="Garamond"/>
+          <w:color w:val="1F2937"/>
+          <w:sz w:val="24"/>
+          <w:szCs w:val="24"/>
+        </w:rPr>
+        <w:t>3.</w:t>
+      </w:r>
+      <w:r>
+        <w:rPr>
+          <w:rFonts w:ascii="Garamond" w:eastAsia="Garamond" w:hAnsi="Garamond" w:cs="Garamond"/>
+          <w:color w:val="1F2937"/>
+          <w:sz w:val="24"/>
+          <w:szCs w:val="24"/>
+        </w:rPr>
+        <w:t>1</w:t>
+      </w:r>
+      <w:r>
+        <w:rPr>
+          <w:rFonts w:ascii="Garamond" w:eastAsia="Garamond" w:hAnsi="Garamond" w:cs="Garamond"/>
+          <w:color w:val="1F2937"/>
+          <w:sz w:val="24"/>
+          <w:szCs w:val="24"/>
+        </w:rPr>
+        <w:t xml:space="preserve">  Описание на строителната площадка:{{Opisanie_Ploshtadka}}</w:t>
       </w:r>
     </w:p>
     <w:p>
@@ -870,14 +914,6 @@
           <w:szCs w:val="24"/>
         </w:rPr>
         <w:t xml:space="preserve"> 4.  Състоянието на околното пространство е: {{Sastoyanie_Okolo}}</w:t>
-      </w:r>
-      <w:r>
-        <w:rPr>
-          <w:rFonts w:ascii="Garamond" w:eastAsia="Garamond" w:hAnsi="Garamond" w:cs="Garamond"/>
-          <w:color w:val="1F2937"/>
-          <w:sz w:val="24"/>
-          <w:szCs w:val="24"/>
-        </w:rPr>
       </w:r>
     </w:p>
     <w:p>
@@ -1415,15 +1451,8 @@
           <w:sz w:val="24"/>
           <w:szCs w:val="24"/>
         </w:rPr>
+        <w:lastRenderedPageBreak/>
         <w:t>3.4. Кота било + {{Kota_Bilo}}</w:t>
-      </w:r>
-      <w:r>
-        <w:rPr>
-          <w:rFonts w:ascii="Garamond" w:eastAsia="Garamond" w:hAnsi="Garamond" w:cs="Garamond"/>
-          <w:color w:val="1F2937"/>
-          <w:sz w:val="24"/>
-          <w:szCs w:val="24"/>
-        </w:rPr>
       </w:r>
     </w:p>
     <w:p>
@@ -1762,6 +1791,7 @@
           <w:sz w:val="24"/>
           <w:szCs w:val="24"/>
         </w:rPr>
+        <w:t xml:space="preserve"> м</w:t>
       </w:r>
     </w:p>
     <w:p>
@@ -1915,22 +1945,6 @@
         </w:rPr>
         <w:t>след проверка на достигнатото ниво изкоп с проектна кота {{Kota_Izkop}} установих, че при изпълнението на СМР:</w:t>
       </w:r>
-      <w:r>
-        <w:rPr>
-          <w:rFonts w:ascii="Garamond" w:eastAsia="Garamond" w:hAnsi="Garamond" w:cs="Garamond"/>
-          <w:color w:val="1F2937"/>
-          <w:sz w:val="24"/>
-          <w:szCs w:val="24"/>
-        </w:rPr>
-      </w:r>
-      <w:r>
-        <w:rPr>
-          <w:rFonts w:ascii="Garamond" w:eastAsia="Garamond" w:hAnsi="Garamond" w:cs="Garamond"/>
-          <w:color w:val="1F2937"/>
-          <w:sz w:val="24"/>
-          <w:szCs w:val="24"/>
-        </w:rPr>
-      </w:r>
     </w:p>
     <w:p/>
     <w:p>
@@ -2034,7 +2048,6 @@
           <w:sz w:val="24"/>
           <w:szCs w:val="24"/>
         </w:rPr>
-        <w:lastRenderedPageBreak/>
         <w:t xml:space="preserve">Разрешавам изпълнението на следващите СМР: </w:t>
       </w:r>
       <w:r>
@@ -2085,6 +2098,7 @@
           <w:sz w:val="24"/>
           <w:szCs w:val="24"/>
         </w:rPr>
+        <w:lastRenderedPageBreak/>
         <w:t>Извършил проверката:</w:t>
       </w:r>
     </w:p>
@@ -2278,37 +2292,448 @@
       <w:r>
         <w:rPr>
           <w:rFonts w:ascii="Garamond" w:eastAsia="Garamond" w:hAnsi="Garamond" w:cs="Garamond"/>
-          <w:color w:val="6B7280"/>
-          <w:sz w:val="24"/>
-          <w:szCs w:val="24"/>
-        </w:rPr>
-        <w:t>{</w:t>
-      </w:r>
-      <w:r>
-        <w:rPr>
-          <w:rFonts w:ascii="Garamond" w:eastAsia="Garamond" w:hAnsi="Garamond" w:cs="Garamond"/>
-          <w:color w:val="6B7280"/>
-          <w:sz w:val="24"/>
-          <w:szCs w:val="24"/>
-        </w:rPr>
-        <w:t>{</w:t>
-      </w:r>
-      <w:bookmarkStart w:id="0" w:name="_GoBack"/>
-      <w:bookmarkEnd w:id="0"/>
-      <w:r>
-        <w:rPr>
-          <w:rFonts w:ascii="Garamond" w:eastAsia="Garamond" w:hAnsi="Garamond" w:cs="Garamond"/>
-          <w:color w:val="6B7280"/>
-          <w:sz w:val="24"/>
-          <w:szCs w:val="24"/>
-        </w:rPr>
-        <w:t xml:space="preserve">Конструктивна}}  </w:t>
+          <w:i/>
+          <w:iCs/>
+          <w:color w:val="6B7280"/>
+          <w:sz w:val="24"/>
+          <w:szCs w:val="24"/>
+        </w:rPr>
+        <w:t>инж.</w:t>
+      </w:r>
+      <w:r>
+        <w:rPr>
+          <w:rFonts w:ascii="Garamond" w:eastAsia="Garamond" w:hAnsi="Garamond" w:cs="Garamond"/>
+          <w:color w:val="6B7280"/>
+          <w:sz w:val="24"/>
+          <w:szCs w:val="24"/>
+        </w:rPr>
+        <w:t>{{Конструктивна</w:t>
+      </w:r>
+      <w:r>
+        <w:rPr>
+          <w:rFonts w:ascii="Garamond" w:eastAsia="Garamond" w:hAnsi="Garamond" w:cs="Garamond"/>
+          <w:color w:val="6B7280"/>
+          <w:sz w:val="24"/>
+          <w:szCs w:val="24"/>
+        </w:rPr>
+        <w:softHyphen/>
+      </w:r>
+      <w:r>
+        <w:rPr>
+          <w:rFonts w:ascii="Garamond" w:eastAsia="Garamond" w:hAnsi="Garamond" w:cs="Garamond"/>
+          <w:color w:val="6B7280"/>
+          <w:sz w:val="24"/>
+          <w:szCs w:val="24"/>
+        </w:rPr>
+        <w:softHyphen/>
+      </w:r>
+      <w:r>
+        <w:rPr>
+          <w:rFonts w:ascii="Garamond" w:eastAsia="Garamond" w:hAnsi="Garamond" w:cs="Garamond"/>
+          <w:i/>
+          <w:iCs/>
+          <w:color w:val="6B7280"/>
+          <w:sz w:val="24"/>
+          <w:szCs w:val="24"/>
+        </w:rPr>
+        <w:t>_1и3</w:t>
+      </w:r>
+      <w:r>
+        <w:rPr>
+          <w:rFonts w:ascii="Garamond" w:eastAsia="Garamond" w:hAnsi="Garamond" w:cs="Garamond"/>
+          <w:color w:val="6B7280"/>
+          <w:sz w:val="24"/>
+          <w:szCs w:val="24"/>
+        </w:rPr>
+        <w:t xml:space="preserve">}}  </w:t>
+      </w:r>
+    </w:p>
+    <w:p>
+      <w:pPr>
+        <w:spacing w:before="100" w:after="60" w:line="360" w:lineRule="auto"/>
+      </w:pPr>
+      <w:r>
+        <w:rPr>
+          <w:rFonts w:ascii="Garamond" w:eastAsia="Garamond" w:hAnsi="Garamond" w:cs="Garamond"/>
+          <w:color w:val="2D3561"/>
+          <w:sz w:val="24"/>
+          <w:szCs w:val="24"/>
+        </w:rPr>
+        <w:t xml:space="preserve">Г. Геодезист:  </w:t>
+      </w:r>
+      <w:r>
+        <w:rPr>
+          <w:rFonts w:ascii="Garamond" w:eastAsia="Garamond" w:hAnsi="Garamond" w:cs="Garamond"/>
+          <w:color w:val="9CA3AF"/>
+          <w:sz w:val="24"/>
+          <w:szCs w:val="24"/>
+        </w:rPr>
+        <w:t xml:space="preserve">..............................   </w:t>
+      </w:r>
+      <w:r>
+        <w:rPr>
+          <w:rFonts w:ascii="Garamond" w:eastAsia="Garamond" w:hAnsi="Garamond" w:cs="Garamond"/>
+          <w:i/>
+          <w:iCs/>
+          <w:color w:val="6B7280"/>
+          <w:sz w:val="24"/>
+          <w:szCs w:val="24"/>
+        </w:rPr>
+        <w:t>(инж.{{Геодезист_1и3}})</w:t>
       </w:r>
     </w:p>
     <w:p>
       <w:pPr>
         <w:spacing w:before="100" w:after="60"/>
       </w:pPr>
+    </w:p>
+    <w:p>
+      <w:pPr>
+        <w:pBdr>
+          <w:bottom w:val="single" w:sz="2" w:space="2" w:color="FDE8EC"/>
+        </w:pBdr>
+        <w:spacing w:before="200" w:after="80"/>
+      </w:pPr>
+      <w:r>
+        <w:rPr>
+          <w:rFonts w:ascii="Garamond" w:eastAsia="Garamond" w:hAnsi="Garamond" w:cs="Garamond"/>
+          <w:b/>
+          <w:bCs/>
+          <w:color w:val="E8647A"/>
+          <w:sz w:val="24"/>
+          <w:szCs w:val="24"/>
+        </w:rPr>
+        <w:t>2. Проверка при ниво цокъл, кота ± 0,00 м</w:t>
+      </w:r>
+    </w:p>
+    <w:p>
+      <w:pPr>
+        <w:spacing w:before="60" w:after="60"/>
+      </w:pPr>
+      <w:r>
+        <w:rPr>
+          <w:rFonts w:ascii="Garamond" w:eastAsia="Garamond" w:hAnsi="Garamond" w:cs="Garamond"/>
+          <w:color w:val="1F2937"/>
+          <w:sz w:val="24"/>
+          <w:szCs w:val="24"/>
+        </w:rPr>
+        <w:t>Днес, ...................................... г., долуподписаният:</w:t>
+      </w:r>
+    </w:p>
+    <w:p/>
+    <w:p>
+      <w:pPr>
+        <w:spacing w:before="60" w:after="60"/>
+      </w:pPr>
+      <w:r>
+        <w:rPr>
+          <w:rFonts w:ascii="Garamond" w:eastAsia="Garamond" w:hAnsi="Garamond" w:cs="Garamond"/>
+          <w:color w:val="1F2937"/>
+          <w:sz w:val="24"/>
+          <w:szCs w:val="24"/>
+        </w:rPr>
+        <w:t>А. Консултант (строителен надзор): инж. {{Управител_1и3}}, квалифицирано лице от списъка на {{Консултант_Фирма}}</w:t>
+      </w:r>
+    </w:p>
+    <w:p>
+      <w:pPr>
+        <w:spacing w:before="60" w:after="60"/>
+      </w:pPr>
+      <w:r>
+        <w:rPr>
+          <w:rFonts w:ascii="Garamond" w:eastAsia="Garamond" w:hAnsi="Garamond" w:cs="Garamond"/>
+          <w:color w:val="1F2937"/>
+          <w:sz w:val="24"/>
+          <w:szCs w:val="24"/>
+        </w:rPr>
+        <w:t>Технически ръководител: {{Строител_ТехРък}}</w:t>
+      </w:r>
+    </w:p>
+    <w:p>
+      <w:pPr>
+        <w:spacing w:before="60" w:after="60"/>
+      </w:pPr>
+      <w:r>
+        <w:rPr>
+          <w:rFonts w:ascii="Garamond" w:eastAsia="Garamond" w:hAnsi="Garamond" w:cs="Garamond"/>
+          <w:color w:val="1F2937"/>
+          <w:sz w:val="24"/>
+          <w:szCs w:val="24"/>
+        </w:rPr>
+        <w:t>В присъствието на:</w:t>
+      </w:r>
+    </w:p>
+    <w:p>
+      <w:pPr>
+        <w:spacing w:before="60" w:after="60"/>
+      </w:pPr>
+      <w:r>
+        <w:rPr>
+          <w:rFonts w:ascii="Garamond" w:eastAsia="Garamond" w:hAnsi="Garamond" w:cs="Garamond"/>
+          <w:color w:val="1F2937"/>
+          <w:sz w:val="24"/>
+          <w:szCs w:val="24"/>
+        </w:rPr>
+        <w:t>Б. Проектанти:</w:t>
+      </w:r>
+    </w:p>
+    <w:p>
+      <w:pPr>
+        <w:spacing w:before="60" w:after="60"/>
+        <w:rPr>
+          <w:rFonts w:ascii="Garamond" w:eastAsia="Garamond" w:hAnsi="Garamond" w:cs="Garamond"/>
+          <w:color w:val="6B7280"/>
+          <w:sz w:val="24"/>
+          <w:szCs w:val="24"/>
+        </w:rPr>
+      </w:pPr>
+      <w:r>
+        <w:rPr>
+          <w:rFonts w:ascii="Garamond" w:eastAsia="Garamond" w:hAnsi="Garamond" w:cs="Garamond"/>
+          <w:color w:val="6B7280"/>
+          <w:sz w:val="24"/>
+          <w:szCs w:val="24"/>
+        </w:rPr>
+        <w:t xml:space="preserve">1. по част "Архитектура": </w:t>
+      </w:r>
+      <w:r>
+        <w:rPr>
+          <w:rFonts w:ascii="Garamond" w:eastAsia="Garamond" w:hAnsi="Garamond" w:cs="Garamond"/>
+          <w:i/>
+          <w:iCs/>
+          <w:color w:val="6B7280"/>
+          <w:sz w:val="24"/>
+          <w:szCs w:val="24"/>
+        </w:rPr>
+        <w:t>арх.</w:t>
+      </w:r>
+      <w:r>
+        <w:rPr>
+          <w:rFonts w:ascii="Garamond" w:eastAsia="Garamond" w:hAnsi="Garamond" w:cs="Garamond"/>
+          <w:color w:val="6B7280"/>
+          <w:sz w:val="24"/>
+          <w:szCs w:val="24"/>
+        </w:rPr>
+        <w:t>{{ПЖ_Архитектура</w:t>
+      </w:r>
+      <w:r>
+        <w:rPr>
+          <w:rFonts w:ascii="Garamond" w:eastAsia="Garamond" w:hAnsi="Garamond" w:cs="Garamond"/>
+          <w:i/>
+          <w:iCs/>
+          <w:color w:val="6B7280"/>
+          <w:sz w:val="24"/>
+          <w:szCs w:val="24"/>
+        </w:rPr>
+        <w:t>_1и3</w:t>
+      </w:r>
+      <w:r>
+        <w:rPr>
+          <w:rFonts w:ascii="Garamond" w:eastAsia="Garamond" w:hAnsi="Garamond" w:cs="Garamond"/>
+          <w:color w:val="6B7280"/>
+          <w:sz w:val="24"/>
+          <w:szCs w:val="24"/>
+        </w:rPr>
+        <w:t>}}</w:t>
+      </w:r>
+      <w:r>
+        <w:rPr>
+          <w:rFonts w:ascii="Garamond" w:eastAsia="Garamond" w:hAnsi="Garamond" w:cs="Garamond"/>
+          <w:color w:val="6B7280"/>
+          <w:sz w:val="24"/>
+          <w:szCs w:val="24"/>
+        </w:rPr>
+        <w:t xml:space="preserve"> </w:t>
+      </w:r>
+    </w:p>
+    <w:p>
+      <w:pPr>
+        <w:spacing w:before="60" w:after="60"/>
+        <w:rPr>
+          <w:rFonts w:ascii="Garamond" w:eastAsia="Garamond" w:hAnsi="Garamond" w:cs="Garamond"/>
+          <w:color w:val="6B7280"/>
+          <w:sz w:val="24"/>
+          <w:szCs w:val="24"/>
+        </w:rPr>
+      </w:pPr>
+      <w:r>
+        <w:rPr>
+          <w:rFonts w:ascii="Garamond" w:eastAsia="Garamond" w:hAnsi="Garamond" w:cs="Garamond"/>
+          <w:color w:val="6B7280"/>
+          <w:sz w:val="24"/>
+          <w:szCs w:val="24"/>
+        </w:rPr>
+        <w:t xml:space="preserve">   2. по част "Конструктивна": </w:t>
+      </w:r>
+      <w:r>
+        <w:rPr>
+          <w:rFonts w:ascii="Garamond" w:eastAsia="Garamond" w:hAnsi="Garamond" w:cs="Garamond"/>
+          <w:i/>
+          <w:iCs/>
+          <w:color w:val="6B7280"/>
+          <w:sz w:val="24"/>
+          <w:szCs w:val="24"/>
+        </w:rPr>
+        <w:t>инж.</w:t>
+      </w:r>
+      <w:r>
+        <w:rPr>
+          <w:rFonts w:ascii="Garamond" w:eastAsia="Garamond" w:hAnsi="Garamond" w:cs="Garamond"/>
+          <w:color w:val="6B7280"/>
+          <w:sz w:val="24"/>
+          <w:szCs w:val="24"/>
+        </w:rPr>
+        <w:t>{{ПЖ_Конструктивна</w:t>
+      </w:r>
+      <w:r>
+        <w:rPr>
+          <w:rFonts w:ascii="Garamond" w:eastAsia="Garamond" w:hAnsi="Garamond" w:cs="Garamond"/>
+          <w:i/>
+          <w:iCs/>
+          <w:color w:val="6B7280"/>
+          <w:sz w:val="24"/>
+          <w:szCs w:val="24"/>
+        </w:rPr>
+        <w:t>_1и3</w:t>
+      </w:r>
+      <w:r>
+        <w:rPr>
+          <w:rFonts w:ascii="Garamond" w:eastAsia="Garamond" w:hAnsi="Garamond" w:cs="Garamond"/>
+          <w:color w:val="6B7280"/>
+          <w:sz w:val="24"/>
+          <w:szCs w:val="24"/>
+        </w:rPr>
+        <w:t>}}</w:t>
+      </w:r>
+    </w:p>
+    <w:p>
+      <w:pPr>
+        <w:spacing w:before="60" w:after="60"/>
+      </w:pPr>
+      <w:r>
+        <w:rPr>
+          <w:rFonts w:ascii="Garamond" w:eastAsia="Garamond" w:hAnsi="Garamond" w:cs="Garamond"/>
+          <w:color w:val="1F2937"/>
+          <w:sz w:val="24"/>
+          <w:szCs w:val="24"/>
+        </w:rPr>
+        <w:t>В. Техническото правоспособно физическо лице по Геодезия: {{Геодезист}}</w:t>
+      </w:r>
+    </w:p>
+    <w:p/>
+    <w:p>
+      <w:pPr>
+        <w:spacing w:before="60" w:after="60"/>
+      </w:pPr>
+      <w:r>
+        <w:rPr>
+          <w:rFonts w:ascii="Garamond" w:eastAsia="Garamond" w:hAnsi="Garamond" w:cs="Garamond"/>
+          <w:color w:val="1F2937"/>
+          <w:sz w:val="24"/>
+          <w:szCs w:val="24"/>
+        </w:rPr>
+        <w:t>след проверка на достигнатото ниво цокъл с проектна кота ± 0,00 м установих, че при изпълнението на СМР:</w:t>
+      </w:r>
+    </w:p>
+    <w:p/>
+    <w:p>
+      <w:pPr>
+        <w:spacing w:before="60" w:after="60"/>
+      </w:pPr>
+      <w:r>
+        <w:rPr>
+          <w:rFonts w:ascii="Garamond" w:eastAsia="Garamond" w:hAnsi="Garamond" w:cs="Garamond"/>
+          <w:color w:val="1F2937"/>
+          <w:sz w:val="24"/>
+          <w:szCs w:val="24"/>
+        </w:rPr>
+        <w:t>а) отговарят на предвидените по проект и издадените строителни книжа;</w:t>
+      </w:r>
+    </w:p>
+    <w:p>
+      <w:pPr>
+        <w:spacing w:before="60" w:after="60"/>
+        <w:rPr>
+          <w:strike/>
+        </w:rPr>
+      </w:pPr>
+      <w:r>
+        <w:rPr>
+          <w:rFonts w:ascii="Garamond" w:eastAsia="Garamond" w:hAnsi="Garamond" w:cs="Garamond"/>
+          <w:i/>
+          <w:iCs/>
+          <w:strike/>
+          <w:color w:val="6B7280"/>
+          <w:sz w:val="24"/>
+          <w:szCs w:val="24"/>
+        </w:rPr>
+        <w:t>б) не отговарят на одобрения проект, като отклонения са констатирани при:</w:t>
+      </w:r>
+    </w:p>
+    <w:p>
+      <w:pPr>
+        <w:spacing w:before="60" w:after="60"/>
+      </w:pPr>
+      <w:r>
+        <w:rPr>
+          <w:rFonts w:ascii="Garamond" w:eastAsia="Garamond" w:hAnsi="Garamond" w:cs="Garamond"/>
+          <w:color w:val="9CA3AF"/>
+          <w:sz w:val="24"/>
+          <w:szCs w:val="24"/>
+        </w:rPr>
+        <w:t>.................................................................................................................................................................</w:t>
+      </w:r>
+    </w:p>
+    <w:p>
+      <w:pPr>
+        <w:spacing w:before="60" w:after="60"/>
+      </w:pPr>
+      <w:r>
+        <w:rPr>
+          <w:rFonts w:ascii="Garamond" w:eastAsia="Garamond" w:hAnsi="Garamond" w:cs="Garamond"/>
+          <w:i/>
+          <w:iCs/>
+          <w:color w:val="6B7280"/>
+          <w:sz w:val="24"/>
+          <w:szCs w:val="24"/>
+        </w:rPr>
+        <w:t>(описват се подробно констатираните отклонения)</w:t>
+      </w:r>
+    </w:p>
+    <w:p/>
+    <w:p>
+      <w:pPr>
+        <w:spacing w:before="60" w:after="60"/>
+      </w:pPr>
+      <w:r>
+        <w:rPr>
+          <w:rFonts w:ascii="Garamond" w:eastAsia="Garamond" w:hAnsi="Garamond" w:cs="Garamond"/>
+          <w:color w:val="1F2937"/>
+          <w:sz w:val="24"/>
+          <w:szCs w:val="24"/>
+        </w:rPr>
+        <w:t>Предвидените в плана за безопасност и здраве мерки са изпълнени (не са изпълнени):</w:t>
+      </w:r>
+    </w:p>
+    <w:p>
+      <w:pPr>
+        <w:spacing w:before="60" w:after="60"/>
+      </w:pPr>
+      <w:r>
+        <w:rPr>
+          <w:rFonts w:ascii="Garamond" w:eastAsia="Garamond" w:hAnsi="Garamond" w:cs="Garamond"/>
+          <w:color w:val="9CA3AF"/>
+          <w:sz w:val="24"/>
+          <w:szCs w:val="24"/>
+        </w:rPr>
+        <w:t>.................................................................................................................................................................</w:t>
+      </w:r>
+    </w:p>
+    <w:p/>
+    <w:p>
+      <w:pPr>
+        <w:spacing w:before="60" w:after="60"/>
+      </w:pPr>
       <w:r>
         <w:rPr>
           <w:rFonts w:ascii="Garamond" w:eastAsia="Garamond" w:hAnsi="Garamond" w:cs="Garamond"/>
@@ -2316,7 +2741,7 @@
           <w:sz w:val="24"/>
           <w:szCs w:val="24"/>
         </w:rPr>
-        <w:t xml:space="preserve">Г. Геодезист:  </w:t>
+        <w:t xml:space="preserve">Разрешавам изпълнението на следващите СМР: </w:t>
       </w:r>
       <w:r>
         <w:rPr>
@@ -2325,18 +2750,21 @@
           <w:sz w:val="24"/>
           <w:szCs w:val="24"/>
         </w:rPr>
-        <w:t xml:space="preserve">..............................   </w:t>
-      </w:r>
-      <w:r>
-        <w:rPr>
-          <w:rFonts w:ascii="Garamond" w:eastAsia="Garamond" w:hAnsi="Garamond" w:cs="Garamond"/>
-          <w:i/>
-          <w:iCs/>
-          <w:color w:val="6B7280"/>
-          <w:sz w:val="24"/>
-          <w:szCs w:val="24"/>
-        </w:rPr>
-        <w:t>({{Геодезист_1и3}})</w:t>
+        <w:t>.................................................................................................</w:t>
+      </w:r>
+    </w:p>
+    <w:p>
+      <w:pPr>
+        <w:spacing w:before="60" w:after="60"/>
+      </w:pPr>
+      <w:r>
+        <w:rPr>
+          <w:rFonts w:ascii="Garamond" w:eastAsia="Garamond" w:hAnsi="Garamond" w:cs="Garamond"/>
+          <w:color w:val="9CA3AF"/>
+          <w:sz w:val="24"/>
+          <w:szCs w:val="24"/>
+        </w:rPr>
+        <w:t>.................................................................................................................................................................</w:t>
       </w:r>
     </w:p>
     <w:p>
@@ -2363,64 +2791,94 @@
           <w:sz w:val="24"/>
           <w:szCs w:val="24"/>
         </w:rPr>
-        <w:t>2. Проверка при ниво цокъл, кота ± 0,00 м</w:t>
-      </w:r>
-    </w:p>
-    <w:p>
-      <w:pPr>
-        <w:spacing w:before="60" w:after="60"/>
-      </w:pPr>
-      <w:r>
-        <w:rPr>
-          <w:rFonts w:ascii="Garamond" w:eastAsia="Garamond" w:hAnsi="Garamond" w:cs="Garamond"/>
-          <w:color w:val="1F2937"/>
-          <w:sz w:val="24"/>
-          <w:szCs w:val="24"/>
-        </w:rPr>
-        <w:t>Днес, ...................................... г., долуподписаният:</w:t>
-      </w:r>
-    </w:p>
-    <w:p/>
-    <w:p>
-      <w:pPr>
-        <w:spacing w:before="60" w:after="60"/>
-      </w:pPr>
-      <w:r>
-        <w:rPr>
-          <w:rFonts w:ascii="Garamond" w:eastAsia="Garamond" w:hAnsi="Garamond" w:cs="Garamond"/>
-          <w:color w:val="1F2937"/>
-          <w:sz w:val="24"/>
-          <w:szCs w:val="24"/>
-        </w:rPr>
-        <w:t>А. Консултант (строителен надзор): инж. {{Управител_1и3}}, квалифицирано лице от списъка на {{Консултант_Фирма}}</w:t>
-      </w:r>
-    </w:p>
-    <w:p>
-      <w:pPr>
-        <w:spacing w:before="60" w:after="60"/>
-      </w:pPr>
-      <w:r>
-        <w:rPr>
-          <w:rFonts w:ascii="Garamond" w:eastAsia="Garamond" w:hAnsi="Garamond" w:cs="Garamond"/>
-          <w:color w:val="1F2937"/>
-          <w:sz w:val="24"/>
-          <w:szCs w:val="24"/>
-        </w:rPr>
-        <w:t>Технически ръководител: {{Строител_ТехРък}}</w:t>
-      </w:r>
-    </w:p>
-    <w:p>
-      <w:pPr>
-        <w:spacing w:before="60" w:after="60"/>
-      </w:pPr>
-      <w:r>
-        <w:rPr>
-          <w:rFonts w:ascii="Garamond" w:eastAsia="Garamond" w:hAnsi="Garamond" w:cs="Garamond"/>
-          <w:color w:val="1F2937"/>
-          <w:sz w:val="24"/>
-          <w:szCs w:val="24"/>
-        </w:rPr>
-        <w:t>В присъствието на:</w:t>
+        <w:t>Извършил проверката:</w:t>
+      </w:r>
+    </w:p>
+    <w:p>
+      <w:pPr>
+        <w:spacing w:before="100" w:after="60"/>
+      </w:pPr>
+      <w:r>
+        <w:rPr>
+          <w:rFonts w:ascii="Garamond" w:eastAsia="Garamond" w:hAnsi="Garamond" w:cs="Garamond"/>
+          <w:color w:val="2D3561"/>
+          <w:sz w:val="24"/>
+          <w:szCs w:val="24"/>
+        </w:rPr>
+        <w:t xml:space="preserve">А. Консултант:  </w:t>
+      </w:r>
+      <w:r>
+        <w:rPr>
+          <w:rFonts w:ascii="Garamond" w:eastAsia="Garamond" w:hAnsi="Garamond" w:cs="Garamond"/>
+          <w:color w:val="9CA3AF"/>
+          <w:sz w:val="24"/>
+          <w:szCs w:val="24"/>
+        </w:rPr>
+        <w:t xml:space="preserve">..............................   </w:t>
+      </w:r>
+      <w:r>
+        <w:rPr>
+          <w:rFonts w:ascii="Garamond" w:eastAsia="Garamond" w:hAnsi="Garamond" w:cs="Garamond"/>
+          <w:i/>
+          <w:iCs/>
+          <w:color w:val="6B7280"/>
+          <w:sz w:val="24"/>
+          <w:szCs w:val="24"/>
+        </w:rPr>
+        <w:t>(инж. {{Управител_1и3}})</w:t>
+      </w:r>
+    </w:p>
+    <w:p>
+      <w:pPr>
+        <w:spacing w:before="100" w:after="60"/>
+      </w:pPr>
+      <w:r>
+        <w:rPr>
+          <w:rFonts w:ascii="Garamond" w:eastAsia="Garamond" w:hAnsi="Garamond" w:cs="Garamond"/>
+          <w:color w:val="2D3561"/>
+          <w:sz w:val="24"/>
+          <w:szCs w:val="24"/>
+        </w:rPr>
+        <w:t xml:space="preserve">Техн. ръководител:  </w:t>
+      </w:r>
+      <w:r>
+        <w:rPr>
+          <w:rFonts w:ascii="Garamond" w:eastAsia="Garamond" w:hAnsi="Garamond" w:cs="Garamond"/>
+          <w:color w:val="9CA3AF"/>
+          <w:sz w:val="24"/>
+          <w:szCs w:val="24"/>
+        </w:rPr>
+        <w:t xml:space="preserve">..............................   </w:t>
+      </w:r>
+      <w:r>
+        <w:rPr>
+          <w:rFonts w:ascii="Garamond" w:eastAsia="Garamond" w:hAnsi="Garamond" w:cs="Garamond"/>
+          <w:i/>
+          <w:iCs/>
+          <w:color w:val="6B7280"/>
+          <w:sz w:val="24"/>
+          <w:szCs w:val="24"/>
+        </w:rPr>
+        <w:t>({{ТехРък_1и3}})</w:t>
+      </w:r>
+    </w:p>
+    <w:p>
+      <w:pPr>
+        <w:pBdr>
+          <w:bottom w:val="single" w:sz="2" w:space="2" w:color="FDE8EC"/>
+        </w:pBdr>
+        <w:spacing w:before="200" w:after="80"/>
+      </w:pPr>
+      <w:r>
+        <w:rPr>
+          <w:rFonts w:ascii="Garamond" w:eastAsia="Garamond" w:hAnsi="Garamond" w:cs="Garamond"/>
+          <w:b/>
+          <w:bCs/>
+          <w:color w:val="E8647A"/>
+          <w:sz w:val="24"/>
+          <w:szCs w:val="24"/>
+        </w:rPr>
+        <w:t>Присъствали:</w:t>
       </w:r>
     </w:p>
     <w:p>
@@ -2439,108 +2897,198 @@
     </w:p>
     <w:p>
       <w:pPr>
-        <w:spacing w:before="60" w:after="60"/>
-        <w:rPr>
-          <w:rFonts w:ascii="Garamond" w:eastAsia="Garamond" w:hAnsi="Garamond" w:cs="Garamond"/>
-          <w:color w:val="6B7280"/>
-          <w:sz w:val="24"/>
-          <w:szCs w:val="24"/>
-        </w:rPr>
-      </w:pPr>
-      <w:r>
-        <w:rPr>
-          <w:rFonts w:ascii="Garamond" w:eastAsia="Garamond" w:hAnsi="Garamond" w:cs="Garamond"/>
-          <w:color w:val="6B7280"/>
-          <w:sz w:val="24"/>
-          <w:szCs w:val="24"/>
-        </w:rPr>
-        <w:t>1. по част "Архитектура": {{ПЖ_Архитектура}}</w:t>
-      </w:r>
-    </w:p>
-    <w:p>
-      <w:pPr>
-        <w:spacing w:before="60" w:after="60"/>
-        <w:rPr>
-          <w:rFonts w:ascii="Garamond" w:eastAsia="Garamond" w:hAnsi="Garamond" w:cs="Garamond"/>
-          <w:color w:val="6B7280"/>
-          <w:sz w:val="24"/>
-          <w:szCs w:val="24"/>
-        </w:rPr>
-      </w:pPr>
-      <w:r>
-        <w:rPr>
-          <w:rFonts w:ascii="Garamond" w:eastAsia="Garamond" w:hAnsi="Garamond" w:cs="Garamond"/>
-          <w:color w:val="6B7280"/>
-          <w:sz w:val="24"/>
-          <w:szCs w:val="24"/>
-        </w:rPr>
-        <w:t xml:space="preserve">   2. по част "Конструктивна": {{ПЖ_Конструктивна}}</w:t>
-      </w:r>
-    </w:p>
-    <w:p>
-      <w:pPr>
-        <w:spacing w:before="60" w:after="60"/>
-      </w:pPr>
-      <w:r>
-        <w:rPr>
-          <w:rFonts w:ascii="Garamond" w:eastAsia="Garamond" w:hAnsi="Garamond" w:cs="Garamond"/>
-          <w:color w:val="1F2937"/>
-          <w:sz w:val="24"/>
-          <w:szCs w:val="24"/>
-        </w:rPr>
-        <w:t>В. Техническото правоспособно физическо лице по Геодезия: {{Геодезист}}</w:t>
-      </w:r>
-    </w:p>
-    <w:p/>
-    <w:p>
-      <w:pPr>
-        <w:spacing w:before="60" w:after="60"/>
-      </w:pPr>
-      <w:r>
-        <w:rPr>
-          <w:rFonts w:ascii="Garamond" w:eastAsia="Garamond" w:hAnsi="Garamond" w:cs="Garamond"/>
-          <w:color w:val="1F2937"/>
-          <w:sz w:val="24"/>
-          <w:szCs w:val="24"/>
-        </w:rPr>
-        <w:t>след проверка на достигнатото ниво цокъл с проектна кота ± 0,00 м установих, че при изпълнението на СМР:</w:t>
-      </w:r>
-    </w:p>
-    <w:p/>
-    <w:p>
-      <w:pPr>
-        <w:spacing w:before="60" w:after="60"/>
-      </w:pPr>
-      <w:r>
-        <w:rPr>
-          <w:rFonts w:ascii="Garamond" w:eastAsia="Garamond" w:hAnsi="Garamond" w:cs="Garamond"/>
-          <w:color w:val="1F2937"/>
-          <w:sz w:val="24"/>
-          <w:szCs w:val="24"/>
-        </w:rPr>
-        <w:t>а) отговарят на предвидените по проект и издадените строителни книжа;</w:t>
-      </w:r>
-    </w:p>
-    <w:p>
-      <w:pPr>
-        <w:spacing w:before="60" w:after="60"/>
-      </w:pPr>
-      <w:r>
-        <w:rPr>
-          <w:rFonts w:ascii="Garamond" w:eastAsia="Garamond" w:hAnsi="Garamond" w:cs="Garamond"/>
-          <w:i/>
-          <w:iCs/>
-          <w:color w:val="6B7280"/>
-          <w:sz w:val="24"/>
-          <w:szCs w:val="24"/>
-        </w:rPr>
-        <w:t>б) не отговарят на одобрения проект, като отклонения са констатирани при:</w:t>
-      </w:r>
-    </w:p>
-    <w:p>
-      <w:pPr>
-        <w:spacing w:before="60" w:after="60"/>
-      </w:pPr>
+        <w:spacing w:before="100" w:after="60"/>
+        <w:rPr>
+          <w:rFonts w:ascii="Garamond" w:eastAsia="Garamond" w:hAnsi="Garamond" w:cs="Garamond"/>
+          <w:color w:val="6B7280"/>
+          <w:sz w:val="24"/>
+          <w:szCs w:val="24"/>
+        </w:rPr>
+      </w:pPr>
+      <w:r>
+        <w:rPr>
+          <w:rFonts w:ascii="Garamond" w:eastAsia="Garamond" w:hAnsi="Garamond" w:cs="Garamond"/>
+          <w:color w:val="6B7280"/>
+          <w:sz w:val="24"/>
+          <w:szCs w:val="24"/>
+        </w:rPr>
+        <w:lastRenderedPageBreak/>
+        <w:t>1. ..............................</w:t>
+      </w:r>
+      <w:r>
+        <w:rPr>
+          <w:rFonts w:ascii="Garamond" w:eastAsia="Garamond" w:hAnsi="Garamond" w:cs="Garamond"/>
+          <w:i/>
+          <w:iCs/>
+          <w:color w:val="6B7280"/>
+          <w:sz w:val="24"/>
+          <w:szCs w:val="24"/>
+        </w:rPr>
+        <w:t xml:space="preserve"> </w:t>
+      </w:r>
+      <w:r>
+        <w:rPr>
+          <w:rFonts w:ascii="Garamond" w:eastAsia="Garamond" w:hAnsi="Garamond" w:cs="Garamond"/>
+          <w:i/>
+          <w:iCs/>
+          <w:color w:val="6B7280"/>
+          <w:sz w:val="24"/>
+          <w:szCs w:val="24"/>
+        </w:rPr>
+        <w:t>арх.</w:t>
+      </w:r>
+      <w:r>
+        <w:rPr>
+          <w:rFonts w:ascii="Garamond" w:eastAsia="Garamond" w:hAnsi="Garamond" w:cs="Garamond"/>
+          <w:color w:val="6B7280"/>
+          <w:sz w:val="24"/>
+          <w:szCs w:val="24"/>
+        </w:rPr>
+        <w:t>{{ПЖ_Архитектура</w:t>
+      </w:r>
+      <w:r>
+        <w:rPr>
+          <w:rFonts w:ascii="Garamond" w:eastAsia="Garamond" w:hAnsi="Garamond" w:cs="Garamond"/>
+          <w:color w:val="6B7280"/>
+          <w:sz w:val="24"/>
+          <w:szCs w:val="24"/>
+        </w:rPr>
+        <w:t xml:space="preserve"> </w:t>
+      </w:r>
+      <w:r>
+        <w:rPr>
+          <w:rFonts w:ascii="Garamond" w:eastAsia="Garamond" w:hAnsi="Garamond" w:cs="Garamond"/>
+          <w:i/>
+          <w:iCs/>
+          <w:color w:val="6B7280"/>
+          <w:sz w:val="24"/>
+          <w:szCs w:val="24"/>
+        </w:rPr>
+        <w:t>_1и3</w:t>
+      </w:r>
+      <w:r>
+        <w:rPr>
+          <w:rFonts w:ascii="Garamond" w:eastAsia="Garamond" w:hAnsi="Garamond" w:cs="Garamond"/>
+          <w:color w:val="6B7280"/>
+          <w:sz w:val="24"/>
+          <w:szCs w:val="24"/>
+        </w:rPr>
+        <w:t xml:space="preserve">}} </w:t>
+      </w:r>
+    </w:p>
+    <w:p>
+      <w:pPr>
+        <w:spacing w:before="100" w:after="60"/>
+        <w:rPr>
+          <w:rFonts w:ascii="Garamond" w:eastAsia="Garamond" w:hAnsi="Garamond" w:cs="Garamond"/>
+          <w:color w:val="6B7280"/>
+          <w:sz w:val="24"/>
+          <w:szCs w:val="24"/>
+        </w:rPr>
+      </w:pPr>
+    </w:p>
+    <w:p>
+      <w:pPr>
+        <w:spacing w:before="100" w:after="60"/>
+        <w:rPr>
+          <w:rFonts w:ascii="Garamond" w:eastAsia="Garamond" w:hAnsi="Garamond" w:cs="Garamond"/>
+          <w:color w:val="6B7280"/>
+          <w:sz w:val="24"/>
+          <w:szCs w:val="24"/>
+        </w:rPr>
+      </w:pPr>
+      <w:r>
+        <w:rPr>
+          <w:rFonts w:ascii="Garamond" w:eastAsia="Garamond" w:hAnsi="Garamond" w:cs="Garamond"/>
+          <w:color w:val="6B7280"/>
+          <w:sz w:val="24"/>
+          <w:szCs w:val="24"/>
+        </w:rPr>
+        <w:t>2. .....................................</w:t>
+      </w:r>
+      <w:r>
+        <w:rPr>
+          <w:rFonts w:ascii="Garamond" w:eastAsia="Garamond" w:hAnsi="Garamond" w:cs="Garamond"/>
+          <w:color w:val="6B7280"/>
+          <w:sz w:val="24"/>
+          <w:szCs w:val="24"/>
+        </w:rPr>
+        <w:t xml:space="preserve"> </w:t>
+      </w:r>
+      <w:r>
+        <w:rPr>
+          <w:rFonts w:ascii="Garamond" w:eastAsia="Garamond" w:hAnsi="Garamond" w:cs="Garamond"/>
+          <w:i/>
+          <w:iCs/>
+          <w:color w:val="6B7280"/>
+          <w:sz w:val="24"/>
+          <w:szCs w:val="24"/>
+        </w:rPr>
+        <w:t>инж.</w:t>
+      </w:r>
+      <w:r>
+        <w:rPr>
+          <w:rFonts w:ascii="Garamond" w:eastAsia="Garamond" w:hAnsi="Garamond" w:cs="Garamond"/>
+          <w:color w:val="6B7280"/>
+          <w:sz w:val="24"/>
+          <w:szCs w:val="24"/>
+        </w:rPr>
+        <w:t>{{ПЖ_Конструктивна</w:t>
+      </w:r>
+      <w:r>
+        <w:rPr>
+          <w:rFonts w:ascii="Garamond" w:eastAsia="Garamond" w:hAnsi="Garamond" w:cs="Garamond"/>
+          <w:color w:val="6B7280"/>
+          <w:sz w:val="24"/>
+          <w:szCs w:val="24"/>
+        </w:rPr>
+        <w:t xml:space="preserve"> </w:t>
+      </w:r>
+      <w:r>
+        <w:rPr>
+          <w:rFonts w:ascii="Garamond" w:eastAsia="Garamond" w:hAnsi="Garamond" w:cs="Garamond"/>
+          <w:i/>
+          <w:iCs/>
+          <w:color w:val="6B7280"/>
+          <w:sz w:val="24"/>
+          <w:szCs w:val="24"/>
+        </w:rPr>
+        <w:t>_1и3</w:t>
+      </w:r>
+      <w:r>
+        <w:rPr>
+          <w:rFonts w:ascii="Garamond" w:eastAsia="Garamond" w:hAnsi="Garamond" w:cs="Garamond"/>
+          <w:color w:val="6B7280"/>
+          <w:sz w:val="24"/>
+          <w:szCs w:val="24"/>
+        </w:rPr>
+        <w:t>}}</w:t>
+      </w:r>
+    </w:p>
+    <w:p>
+      <w:pPr>
+        <w:spacing w:before="100" w:after="60"/>
+        <w:rPr>
+          <w:rFonts w:ascii="Garamond" w:eastAsia="Garamond" w:hAnsi="Garamond" w:cs="Garamond"/>
+          <w:color w:val="6B7280"/>
+          <w:sz w:val="24"/>
+          <w:szCs w:val="24"/>
+        </w:rPr>
+      </w:pPr>
+    </w:p>
+    <w:p>
+      <w:pPr>
+        <w:spacing w:before="100" w:after="60"/>
+      </w:pPr>
+      <w:r>
+        <w:rPr>
+          <w:rFonts w:ascii="Garamond" w:eastAsia="Garamond" w:hAnsi="Garamond" w:cs="Garamond"/>
+          <w:color w:val="2D3561"/>
+          <w:sz w:val="24"/>
+          <w:szCs w:val="24"/>
+        </w:rPr>
+        <w:t xml:space="preserve">В. Геодезист:  </w:t>
+      </w:r>
       <w:r>
         <w:rPr>
           <w:rFonts w:ascii="Garamond" w:eastAsia="Garamond" w:hAnsi="Garamond" w:cs="Garamond"/>
@@ -2548,90 +3096,18 @@
           <w:sz w:val="24"/>
           <w:szCs w:val="24"/>
         </w:rPr>
-        <w:t>.................................................................................................................................................................</w:t>
-      </w:r>
-    </w:p>
-    <w:p>
-      <w:pPr>
-        <w:spacing w:before="60" w:after="60"/>
-      </w:pPr>
-      <w:r>
-        <w:rPr>
-          <w:rFonts w:ascii="Garamond" w:eastAsia="Garamond" w:hAnsi="Garamond" w:cs="Garamond"/>
-          <w:i/>
-          <w:iCs/>
-          <w:color w:val="6B7280"/>
-          <w:sz w:val="24"/>
-          <w:szCs w:val="24"/>
-        </w:rPr>
-        <w:t>(описват се подробно констатираните отклонения)</w:t>
-      </w:r>
-    </w:p>
-    <w:p/>
-    <w:p>
-      <w:pPr>
-        <w:spacing w:before="60" w:after="60"/>
-      </w:pPr>
-      <w:r>
-        <w:rPr>
-          <w:rFonts w:ascii="Garamond" w:eastAsia="Garamond" w:hAnsi="Garamond" w:cs="Garamond"/>
-          <w:color w:val="1F2937"/>
-          <w:sz w:val="24"/>
-          <w:szCs w:val="24"/>
-        </w:rPr>
-        <w:t>Предвидените в плана за безопасност и здраве мерки са изпълнени (не са изпълнени):</w:t>
-      </w:r>
-    </w:p>
-    <w:p>
-      <w:pPr>
-        <w:spacing w:before="60" w:after="60"/>
-      </w:pPr>
-      <w:r>
-        <w:rPr>
-          <w:rFonts w:ascii="Garamond" w:eastAsia="Garamond" w:hAnsi="Garamond" w:cs="Garamond"/>
-          <w:color w:val="9CA3AF"/>
-          <w:sz w:val="24"/>
-          <w:szCs w:val="24"/>
-        </w:rPr>
-        <w:t>.................................................................................................................................................................</w:t>
-      </w:r>
-    </w:p>
-    <w:p/>
-    <w:p>
-      <w:pPr>
-        <w:spacing w:before="60" w:after="60"/>
-      </w:pPr>
-      <w:r>
-        <w:rPr>
-          <w:rFonts w:ascii="Garamond" w:eastAsia="Garamond" w:hAnsi="Garamond" w:cs="Garamond"/>
-          <w:color w:val="2D3561"/>
-          <w:sz w:val="24"/>
-          <w:szCs w:val="24"/>
-        </w:rPr>
-        <w:t xml:space="preserve">Разрешавам изпълнението на следващите СМР: </w:t>
-      </w:r>
-      <w:r>
-        <w:rPr>
-          <w:rFonts w:ascii="Garamond" w:eastAsia="Garamond" w:hAnsi="Garamond" w:cs="Garamond"/>
-          <w:color w:val="9CA3AF"/>
-          <w:sz w:val="24"/>
-          <w:szCs w:val="24"/>
-        </w:rPr>
-        <w:t>.................................................................................................</w:t>
-      </w:r>
-    </w:p>
-    <w:p>
-      <w:pPr>
-        <w:spacing w:before="60" w:after="60"/>
-      </w:pPr>
-      <w:r>
-        <w:rPr>
-          <w:rFonts w:ascii="Garamond" w:eastAsia="Garamond" w:hAnsi="Garamond" w:cs="Garamond"/>
-          <w:color w:val="9CA3AF"/>
-          <w:sz w:val="24"/>
-          <w:szCs w:val="24"/>
-        </w:rPr>
-        <w:t>.................................................................................................................................................................</w:t>
+        <w:t xml:space="preserve">..............................   </w:t>
+      </w:r>
+      <w:r>
+        <w:rPr>
+          <w:rFonts w:ascii="Garamond" w:eastAsia="Garamond" w:hAnsi="Garamond" w:cs="Garamond"/>
+          <w:i/>
+          <w:iCs/>
+          <w:color w:val="6B7280"/>
+          <w:sz w:val="24"/>
+          <w:szCs w:val="24"/>
+        </w:rPr>
+        <w:t>(инж.{{Геодезист_1и3}})</w:t>
       </w:r>
     </w:p>
     <w:p>
@@ -2658,12 +3134,347 @@
           <w:sz w:val="24"/>
           <w:szCs w:val="24"/>
         </w:rPr>
-        <w:t>Извършил проверката:</w:t>
-      </w:r>
-    </w:p>
-    <w:p>
-      <w:pPr>
-        <w:spacing w:before="100" w:after="60"/>
+        <w:t xml:space="preserve">3. Проверка при ниво корниз (стреха), кота {{Kota_Korniz}} </w:t>
+      </w:r>
+      <w:r>
+        <w:rPr>
+          <w:rFonts w:ascii="Garamond" w:eastAsia="Garamond" w:hAnsi="Garamond" w:cs="Garamond"/>
+          <w:b/>
+          <w:bCs/>
+          <w:color w:val="E8647A"/>
+          <w:sz w:val="24"/>
+          <w:szCs w:val="24"/>
+        </w:rPr>
+        <w:t>м</w:t>
+      </w:r>
+    </w:p>
+    <w:p>
+      <w:pPr>
+        <w:spacing w:before="60" w:after="60"/>
+      </w:pPr>
+      <w:r>
+        <w:rPr>
+          <w:rFonts w:ascii="Garamond" w:eastAsia="Garamond" w:hAnsi="Garamond" w:cs="Garamond"/>
+          <w:color w:val="1F2937"/>
+          <w:sz w:val="24"/>
+          <w:szCs w:val="24"/>
+        </w:rPr>
+        <w:t>Днес, ...................................... г., долуподписаният:</w:t>
+      </w:r>
+    </w:p>
+    <w:p/>
+    <w:p>
+      <w:pPr>
+        <w:spacing w:before="60" w:after="60"/>
+      </w:pPr>
+      <w:r>
+        <w:rPr>
+          <w:rFonts w:ascii="Garamond" w:eastAsia="Garamond" w:hAnsi="Garamond" w:cs="Garamond"/>
+          <w:color w:val="1F2937"/>
+          <w:sz w:val="24"/>
+          <w:szCs w:val="24"/>
+        </w:rPr>
+        <w:t>А. Консултант (строителен надзор): инж. {{Управител_1и3}}, квалифицирано лице от списъка на {{Консултант_Фирма}}</w:t>
+      </w:r>
+    </w:p>
+    <w:p>
+      <w:pPr>
+        <w:spacing w:before="60" w:after="60"/>
+      </w:pPr>
+      <w:r>
+        <w:rPr>
+          <w:rFonts w:ascii="Garamond" w:eastAsia="Garamond" w:hAnsi="Garamond" w:cs="Garamond"/>
+          <w:color w:val="1F2937"/>
+          <w:sz w:val="24"/>
+          <w:szCs w:val="24"/>
+        </w:rPr>
+        <w:t>Технически ръководител: {{Строител_ТехРък}}</w:t>
+      </w:r>
+    </w:p>
+    <w:p>
+      <w:pPr>
+        <w:spacing w:before="60" w:after="60"/>
+      </w:pPr>
+      <w:r>
+        <w:rPr>
+          <w:rFonts w:ascii="Garamond" w:eastAsia="Garamond" w:hAnsi="Garamond" w:cs="Garamond"/>
+          <w:color w:val="1F2937"/>
+          <w:sz w:val="24"/>
+          <w:szCs w:val="24"/>
+        </w:rPr>
+        <w:t>В присъствието на:</w:t>
+      </w:r>
+    </w:p>
+    <w:p>
+      <w:pPr>
+        <w:spacing w:before="60" w:after="60"/>
+      </w:pPr>
+      <w:r>
+        <w:rPr>
+          <w:rFonts w:ascii="Garamond" w:eastAsia="Garamond" w:hAnsi="Garamond" w:cs="Garamond"/>
+          <w:color w:val="1F2937"/>
+          <w:sz w:val="24"/>
+          <w:szCs w:val="24"/>
+        </w:rPr>
+        <w:t>Б. Проектанти:</w:t>
+      </w:r>
+    </w:p>
+    <w:p>
+      <w:pPr>
+        <w:spacing w:before="60" w:after="60"/>
+        <w:rPr>
+          <w:rFonts w:ascii="Garamond" w:eastAsia="Garamond" w:hAnsi="Garamond" w:cs="Garamond"/>
+          <w:color w:val="6B7280"/>
+          <w:sz w:val="24"/>
+          <w:szCs w:val="24"/>
+        </w:rPr>
+      </w:pPr>
+      <w:r>
+        <w:rPr>
+          <w:rFonts w:ascii="Garamond" w:eastAsia="Garamond" w:hAnsi="Garamond" w:cs="Garamond"/>
+          <w:color w:val="6B7280"/>
+          <w:sz w:val="24"/>
+          <w:szCs w:val="24"/>
+        </w:rPr>
+        <w:t xml:space="preserve">1. по част "Архитектура": </w:t>
+      </w:r>
+      <w:r>
+        <w:rPr>
+          <w:rFonts w:ascii="Garamond" w:eastAsia="Garamond" w:hAnsi="Garamond" w:cs="Garamond"/>
+          <w:i/>
+          <w:iCs/>
+          <w:color w:val="6B7280"/>
+          <w:sz w:val="24"/>
+          <w:szCs w:val="24"/>
+        </w:rPr>
+        <w:t>арх.</w:t>
+      </w:r>
+      <w:r>
+        <w:rPr>
+          <w:rFonts w:ascii="Garamond" w:eastAsia="Garamond" w:hAnsi="Garamond" w:cs="Garamond"/>
+          <w:color w:val="6B7280"/>
+          <w:sz w:val="24"/>
+          <w:szCs w:val="24"/>
+        </w:rPr>
+        <w:t>{{ПЖ_Архитектура</w:t>
+      </w:r>
+      <w:r>
+        <w:rPr>
+          <w:rFonts w:ascii="Garamond" w:eastAsia="Garamond" w:hAnsi="Garamond" w:cs="Garamond"/>
+          <w:i/>
+          <w:iCs/>
+          <w:color w:val="6B7280"/>
+          <w:sz w:val="24"/>
+          <w:szCs w:val="24"/>
+        </w:rPr>
+        <w:t>_1и3</w:t>
+      </w:r>
+      <w:r>
+        <w:rPr>
+          <w:rFonts w:ascii="Garamond" w:eastAsia="Garamond" w:hAnsi="Garamond" w:cs="Garamond"/>
+          <w:color w:val="6B7280"/>
+          <w:sz w:val="24"/>
+          <w:szCs w:val="24"/>
+        </w:rPr>
+        <w:t>}}</w:t>
+      </w:r>
+      <w:r>
+        <w:rPr>
+          <w:rFonts w:ascii="Garamond" w:eastAsia="Garamond" w:hAnsi="Garamond" w:cs="Garamond"/>
+          <w:color w:val="6B7280"/>
+          <w:sz w:val="24"/>
+          <w:szCs w:val="24"/>
+        </w:rPr>
+        <w:t xml:space="preserve"> </w:t>
+      </w:r>
+    </w:p>
+    <w:p>
+      <w:pPr>
+        <w:spacing w:before="60" w:after="60"/>
+        <w:rPr>
+          <w:rFonts w:ascii="Garamond" w:eastAsia="Garamond" w:hAnsi="Garamond" w:cs="Garamond"/>
+          <w:color w:val="6B7280"/>
+          <w:sz w:val="24"/>
+          <w:szCs w:val="24"/>
+        </w:rPr>
+      </w:pPr>
+      <w:r>
+        <w:rPr>
+          <w:rFonts w:ascii="Garamond" w:eastAsia="Garamond" w:hAnsi="Garamond" w:cs="Garamond"/>
+          <w:color w:val="6B7280"/>
+          <w:sz w:val="24"/>
+          <w:szCs w:val="24"/>
+        </w:rPr>
+        <w:t xml:space="preserve">2. по част "Конструктивна": </w:t>
+      </w:r>
+      <w:r>
+        <w:rPr>
+          <w:rFonts w:ascii="Garamond" w:eastAsia="Garamond" w:hAnsi="Garamond" w:cs="Garamond"/>
+          <w:i/>
+          <w:iCs/>
+          <w:color w:val="6B7280"/>
+          <w:sz w:val="24"/>
+          <w:szCs w:val="24"/>
+        </w:rPr>
+        <w:t>инж.</w:t>
+      </w:r>
+      <w:r>
+        <w:rPr>
+          <w:rFonts w:ascii="Garamond" w:eastAsia="Garamond" w:hAnsi="Garamond" w:cs="Garamond"/>
+          <w:color w:val="6B7280"/>
+          <w:sz w:val="24"/>
+          <w:szCs w:val="24"/>
+        </w:rPr>
+        <w:t>{{ПЖ_Конструктивна</w:t>
+      </w:r>
+      <w:r>
+        <w:rPr>
+          <w:rFonts w:ascii="Garamond" w:eastAsia="Garamond" w:hAnsi="Garamond" w:cs="Garamond"/>
+          <w:i/>
+          <w:iCs/>
+          <w:color w:val="6B7280"/>
+          <w:sz w:val="24"/>
+          <w:szCs w:val="24"/>
+        </w:rPr>
+        <w:t>_1и3</w:t>
+      </w:r>
+      <w:r>
+        <w:rPr>
+          <w:rFonts w:ascii="Garamond" w:eastAsia="Garamond" w:hAnsi="Garamond" w:cs="Garamond"/>
+          <w:color w:val="6B7280"/>
+          <w:sz w:val="24"/>
+          <w:szCs w:val="24"/>
+        </w:rPr>
+        <w:t>}}</w:t>
+      </w:r>
+    </w:p>
+    <w:p>
+      <w:pPr>
+        <w:spacing w:before="60" w:after="60"/>
+      </w:pPr>
+      <w:r>
+        <w:rPr>
+          <w:rFonts w:ascii="Garamond" w:eastAsia="Garamond" w:hAnsi="Garamond" w:cs="Garamond"/>
+          <w:color w:val="1F2937"/>
+          <w:sz w:val="24"/>
+          <w:szCs w:val="24"/>
+        </w:rPr>
+        <w:t>В. Техническото правоспособно физическо лице по Геодезия: {{Геодезист}}</w:t>
+      </w:r>
+    </w:p>
+    <w:p/>
+    <w:p>
+      <w:pPr>
+        <w:spacing w:before="60" w:after="60"/>
+      </w:pPr>
+      <w:r>
+        <w:rPr>
+          <w:rFonts w:ascii="Garamond" w:eastAsia="Garamond" w:hAnsi="Garamond" w:cs="Garamond"/>
+          <w:color w:val="1F2937"/>
+          <w:sz w:val="24"/>
+          <w:szCs w:val="24"/>
+        </w:rPr>
+        <w:t>след проверка на достигнатото ниво корниз с проектна кота {{Kota_Korniz}}  установих, че при изпълнението на СМР:</w:t>
+      </w:r>
+    </w:p>
+    <w:p/>
+    <w:p>
+      <w:pPr>
+        <w:spacing w:before="60" w:after="60"/>
+      </w:pPr>
+      <w:r>
+        <w:rPr>
+          <w:rFonts w:ascii="Garamond" w:eastAsia="Garamond" w:hAnsi="Garamond" w:cs="Garamond"/>
+          <w:color w:val="1F2937"/>
+          <w:sz w:val="24"/>
+          <w:szCs w:val="24"/>
+        </w:rPr>
+        <w:t>а) отговарят на предвидените по проект и издадените строителни книжа;</w:t>
+      </w:r>
+    </w:p>
+    <w:p>
+      <w:pPr>
+        <w:spacing w:before="60" w:after="60"/>
+        <w:rPr>
+          <w:strike/>
+        </w:rPr>
+      </w:pPr>
+      <w:r>
+        <w:rPr>
+          <w:rFonts w:ascii="Garamond" w:eastAsia="Garamond" w:hAnsi="Garamond" w:cs="Garamond"/>
+          <w:i/>
+          <w:iCs/>
+          <w:strike/>
+          <w:color w:val="6B7280"/>
+          <w:sz w:val="24"/>
+          <w:szCs w:val="24"/>
+        </w:rPr>
+        <w:t>б) не отговарят на одобрения проект, като отклонения са констатирани при:</w:t>
+      </w:r>
+    </w:p>
+    <w:p>
+      <w:pPr>
+        <w:spacing w:before="60" w:after="60"/>
+      </w:pPr>
+      <w:r>
+        <w:rPr>
+          <w:rFonts w:ascii="Garamond" w:eastAsia="Garamond" w:hAnsi="Garamond" w:cs="Garamond"/>
+          <w:color w:val="9CA3AF"/>
+          <w:sz w:val="24"/>
+          <w:szCs w:val="24"/>
+        </w:rPr>
+        <w:t>.................................................................................................................................................................</w:t>
+      </w:r>
+    </w:p>
+    <w:p>
+      <w:pPr>
+        <w:spacing w:before="60" w:after="60"/>
+      </w:pPr>
+      <w:r>
+        <w:rPr>
+          <w:rFonts w:ascii="Garamond" w:eastAsia="Garamond" w:hAnsi="Garamond" w:cs="Garamond"/>
+          <w:i/>
+          <w:iCs/>
+          <w:color w:val="6B7280"/>
+          <w:sz w:val="24"/>
+          <w:szCs w:val="24"/>
+        </w:rPr>
+        <w:t>(описват се подробно констатираните отклонения)</w:t>
+      </w:r>
+    </w:p>
+    <w:p/>
+    <w:p>
+      <w:pPr>
+        <w:spacing w:before="60" w:after="60"/>
+      </w:pPr>
+      <w:r>
+        <w:rPr>
+          <w:rFonts w:ascii="Garamond" w:eastAsia="Garamond" w:hAnsi="Garamond" w:cs="Garamond"/>
+          <w:color w:val="1F2937"/>
+          <w:sz w:val="24"/>
+          <w:szCs w:val="24"/>
+        </w:rPr>
+        <w:t>Предвидените в плана за безопасност и здраве мерки са изпълнени (не са изпълнени):</w:t>
+      </w:r>
+    </w:p>
+    <w:p>
+      <w:pPr>
+        <w:spacing w:before="60" w:after="60"/>
+      </w:pPr>
+      <w:r>
+        <w:rPr>
+          <w:rFonts w:ascii="Garamond" w:eastAsia="Garamond" w:hAnsi="Garamond" w:cs="Garamond"/>
+          <w:color w:val="9CA3AF"/>
+          <w:sz w:val="24"/>
+          <w:szCs w:val="24"/>
+        </w:rPr>
+        <w:t>.................................................................................................................................................................</w:t>
+      </w:r>
+    </w:p>
+    <w:p/>
+    <w:p>
+      <w:pPr>
+        <w:spacing w:before="60" w:after="60"/>
       </w:pPr>
       <w:r>
         <w:rPr>
@@ -2672,7 +3483,7 @@
           <w:sz w:val="24"/>
           <w:szCs w:val="24"/>
         </w:rPr>
-        <w:t xml:space="preserve">А. Консултант:  </w:t>
+        <w:t xml:space="preserve">Разрешавам изпълнението на следващите СМР: </w:t>
       </w:r>
       <w:r>
         <w:rPr>
@@ -2681,34 +3492,13 @@
           <w:sz w:val="24"/>
           <w:szCs w:val="24"/>
         </w:rPr>
-        <w:t xml:space="preserve">..............................   </w:t>
-      </w:r>
-      <w:r>
-        <w:rPr>
-          <w:rFonts w:ascii="Garamond" w:eastAsia="Garamond" w:hAnsi="Garamond" w:cs="Garamond"/>
-          <w:i/>
-          <w:iCs/>
-          <w:color w:val="6B7280"/>
-          <w:sz w:val="24"/>
-          <w:szCs w:val="24"/>
-        </w:rPr>
-        <w:t>(инж. {{Управител_1и3}})</w:t>
-      </w:r>
-    </w:p>
-    <w:p>
-      <w:pPr>
-        <w:spacing w:before="100" w:after="60"/>
-      </w:pPr>
-      <w:r>
-        <w:rPr>
-          <w:rFonts w:ascii="Garamond" w:eastAsia="Garamond" w:hAnsi="Garamond" w:cs="Garamond"/>
-          <w:color w:val="2D3561"/>
-          <w:sz w:val="24"/>
-          <w:szCs w:val="24"/>
-        </w:rPr>
-        <w:lastRenderedPageBreak/>
-        <w:t xml:space="preserve">Техн. ръководител:  </w:t>
-      </w:r>
+        <w:t>.................................................................................................</w:t>
+      </w:r>
+    </w:p>
+    <w:p>
+      <w:pPr>
+        <w:spacing w:before="60" w:after="60"/>
+      </w:pPr>
       <w:r>
         <w:rPr>
           <w:rFonts w:ascii="Garamond" w:eastAsia="Garamond" w:hAnsi="Garamond" w:cs="Garamond"/>
@@ -2716,19 +3506,16 @@
           <w:sz w:val="24"/>
           <w:szCs w:val="24"/>
         </w:rPr>
-        <w:t xml:space="preserve">..............................   </w:t>
-      </w:r>
-      <w:r>
-        <w:rPr>
-          <w:rFonts w:ascii="Garamond" w:eastAsia="Garamond" w:hAnsi="Garamond" w:cs="Garamond"/>
-          <w:i/>
-          <w:iCs/>
-          <w:color w:val="6B7280"/>
-          <w:sz w:val="24"/>
-          <w:szCs w:val="24"/>
-        </w:rPr>
-        <w:t>({{ТехРък_1и3}})</w:t>
-      </w:r>
+        <w:t>.................................................................................................................................................................</w:t>
+      </w:r>
+    </w:p>
+    <w:p>
+      <w:pPr>
+        <w:pBdr>
+          <w:bottom w:val="single" w:sz="2" w:space="2" w:color="E5E7EB"/>
+        </w:pBdr>
+        <w:spacing w:before="120" w:after="120"/>
+      </w:pPr>
     </w:p>
     <w:p>
       <w:pPr>
@@ -2746,6 +3533,93 @@
           <w:sz w:val="24"/>
           <w:szCs w:val="24"/>
         </w:rPr>
+        <w:t>Извършил проверката:</w:t>
+      </w:r>
+    </w:p>
+    <w:p>
+      <w:pPr>
+        <w:spacing w:before="100" w:after="60"/>
+      </w:pPr>
+      <w:r>
+        <w:rPr>
+          <w:rFonts w:ascii="Garamond" w:eastAsia="Garamond" w:hAnsi="Garamond" w:cs="Garamond"/>
+          <w:color w:val="2D3561"/>
+          <w:sz w:val="24"/>
+          <w:szCs w:val="24"/>
+        </w:rPr>
+        <w:t xml:space="preserve">А. Консултант:  </w:t>
+      </w:r>
+      <w:r>
+        <w:rPr>
+          <w:rFonts w:ascii="Garamond" w:eastAsia="Garamond" w:hAnsi="Garamond" w:cs="Garamond"/>
+          <w:color w:val="9CA3AF"/>
+          <w:sz w:val="24"/>
+          <w:szCs w:val="24"/>
+        </w:rPr>
+        <w:t xml:space="preserve">..............................   </w:t>
+      </w:r>
+      <w:r>
+        <w:rPr>
+          <w:rFonts w:ascii="Garamond" w:eastAsia="Garamond" w:hAnsi="Garamond" w:cs="Garamond"/>
+          <w:i/>
+          <w:iCs/>
+          <w:color w:val="6B7280"/>
+          <w:sz w:val="24"/>
+          <w:szCs w:val="24"/>
+        </w:rPr>
+        <w:t>(инж. {{Управител_1и3}})</w:t>
+      </w:r>
+    </w:p>
+    <w:p>
+      <w:pPr>
+        <w:spacing w:before="100" w:after="60"/>
+      </w:pPr>
+      <w:r>
+        <w:rPr>
+          <w:rFonts w:ascii="Garamond" w:eastAsia="Garamond" w:hAnsi="Garamond" w:cs="Garamond"/>
+          <w:color w:val="2D3561"/>
+          <w:sz w:val="24"/>
+          <w:szCs w:val="24"/>
+        </w:rPr>
+        <w:t xml:space="preserve">Техн. ръководител:  </w:t>
+      </w:r>
+      <w:r>
+        <w:rPr>
+          <w:rFonts w:ascii="Garamond" w:eastAsia="Garamond" w:hAnsi="Garamond" w:cs="Garamond"/>
+          <w:color w:val="9CA3AF"/>
+          <w:sz w:val="24"/>
+          <w:szCs w:val="24"/>
+        </w:rPr>
+        <w:t xml:space="preserve">..............................   </w:t>
+      </w:r>
+      <w:r>
+        <w:rPr>
+          <w:rFonts w:ascii="Garamond" w:eastAsia="Garamond" w:hAnsi="Garamond" w:cs="Garamond"/>
+          <w:i/>
+          <w:iCs/>
+          <w:color w:val="6B7280"/>
+          <w:sz w:val="24"/>
+          <w:szCs w:val="24"/>
+        </w:rPr>
+        <w:t>({{ТехРък_1и3}})</w:t>
+      </w:r>
+    </w:p>
+    <w:p>
+      <w:pPr>
+        <w:pBdr>
+          <w:bottom w:val="single" w:sz="2" w:space="2" w:color="FDE8EC"/>
+        </w:pBdr>
+        <w:spacing w:before="200" w:after="80"/>
+      </w:pPr>
+      <w:r>
+        <w:rPr>
+          <w:rFonts w:ascii="Garamond" w:eastAsia="Garamond" w:hAnsi="Garamond" w:cs="Garamond"/>
+          <w:b/>
+          <w:bCs/>
+          <w:color w:val="E8647A"/>
+          <w:sz w:val="24"/>
+          <w:szCs w:val="24"/>
+        </w:rPr>
         <w:t>Присъствали:</w:t>
       </w:r>
     </w:p>
@@ -2785,11 +3659,62 @@
       <w:r>
         <w:rPr>
           <w:rFonts w:ascii="Garamond" w:eastAsia="Garamond" w:hAnsi="Garamond" w:cs="Garamond"/>
-          <w:color w:val="6B7280"/>
-          <w:sz w:val="24"/>
-          <w:szCs w:val="24"/>
-        </w:rPr>
-        <w:t xml:space="preserve">{{ПЖ_Архитектура}} </w:t>
+          <w:i/>
+          <w:iCs/>
+          <w:color w:val="6B7280"/>
+          <w:sz w:val="24"/>
+          <w:szCs w:val="24"/>
+        </w:rPr>
+        <w:t xml:space="preserve"> </w:t>
+      </w:r>
+      <w:r>
+        <w:rPr>
+          <w:rFonts w:ascii="Garamond" w:eastAsia="Garamond" w:hAnsi="Garamond" w:cs="Garamond"/>
+          <w:i/>
+          <w:iCs/>
+          <w:color w:val="6B7280"/>
+          <w:sz w:val="24"/>
+          <w:szCs w:val="24"/>
+        </w:rPr>
+        <w:t>арх.</w:t>
+      </w:r>
+      <w:r>
+        <w:rPr>
+          <w:rFonts w:ascii="Garamond" w:eastAsia="Garamond" w:hAnsi="Garamond" w:cs="Garamond"/>
+          <w:color w:val="6B7280"/>
+          <w:sz w:val="24"/>
+          <w:szCs w:val="24"/>
+        </w:rPr>
+        <w:t>{{ПЖ_Архитектура</w:t>
+      </w:r>
+      <w:r>
+        <w:rPr>
+          <w:rFonts w:ascii="Garamond" w:eastAsia="Garamond" w:hAnsi="Garamond" w:cs="Garamond"/>
+          <w:color w:val="6B7280"/>
+          <w:sz w:val="24"/>
+          <w:szCs w:val="24"/>
+        </w:rPr>
+        <w:t xml:space="preserve"> </w:t>
+      </w:r>
+      <w:r>
+        <w:rPr>
+          <w:rFonts w:ascii="Garamond" w:eastAsia="Garamond" w:hAnsi="Garamond" w:cs="Garamond"/>
+          <w:i/>
+          <w:iCs/>
+          <w:color w:val="6B7280"/>
+          <w:sz w:val="24"/>
+          <w:szCs w:val="24"/>
+        </w:rPr>
+        <w:t>_1и3</w:t>
+      </w:r>
+      <w:r>
+        <w:rPr>
+          <w:rFonts w:ascii="Garamond" w:eastAsia="Garamond" w:hAnsi="Garamond" w:cs="Garamond"/>
+          <w:color w:val="6B7280"/>
+          <w:sz w:val="24"/>
+          <w:szCs w:val="24"/>
+        </w:rPr>
+        <w:t xml:space="preserve">}} </w:t>
       </w:r>
     </w:p>
     <w:p>
@@ -2802,6 +3727,17 @@
           <w:szCs w:val="24"/>
         </w:rPr>
       </w:pPr>
+    </w:p>
+    <w:p>
+      <w:pPr>
+        <w:spacing w:before="100" w:after="60"/>
+        <w:rPr>
+          <w:rFonts w:ascii="Garamond" w:eastAsia="Garamond" w:hAnsi="Garamond" w:cs="Garamond"/>
+          <w:color w:val="6B7280"/>
+          <w:sz w:val="24"/>
+          <w:szCs w:val="24"/>
+        </w:rPr>
+      </w:pPr>
       <w:r>
         <w:rPr>
           <w:rFonts w:ascii="Garamond" w:eastAsia="Garamond" w:hAnsi="Garamond" w:cs="Garamond"/>
@@ -2818,7 +3754,56 @@
           <w:sz w:val="24"/>
           <w:szCs w:val="24"/>
         </w:rPr>
-        <w:t xml:space="preserve"> {{ПЖ_Конструктивна}}</w:t>
+        <w:t xml:space="preserve"> </w:t>
+      </w:r>
+      <w:r>
+        <w:rPr>
+          <w:rFonts w:ascii="Garamond" w:eastAsia="Garamond" w:hAnsi="Garamond" w:cs="Garamond"/>
+          <w:i/>
+          <w:iCs/>
+          <w:color w:val="6B7280"/>
+          <w:sz w:val="24"/>
+          <w:szCs w:val="24"/>
+        </w:rPr>
+        <w:t>инж.</w:t>
+      </w:r>
+      <w:r>
+        <w:rPr>
+          <w:rFonts w:ascii="Garamond" w:eastAsia="Garamond" w:hAnsi="Garamond" w:cs="Garamond"/>
+          <w:color w:val="6B7280"/>
+          <w:sz w:val="24"/>
+          <w:szCs w:val="24"/>
+        </w:rPr>
+        <w:t>{{ПЖ_Конструктивна</w:t>
+      </w:r>
+      <w:r>
+        <w:rPr>
+          <w:rFonts w:ascii="Garamond" w:eastAsia="Garamond" w:hAnsi="Garamond" w:cs="Garamond"/>
+          <w:color w:val="6B7280"/>
+          <w:sz w:val="24"/>
+          <w:szCs w:val="24"/>
+        </w:rPr>
+        <w:t xml:space="preserve"> </w:t>
+      </w:r>
+      <w:r>
+        <w:rPr>
+          <w:rFonts w:ascii="Garamond" w:eastAsia="Garamond" w:hAnsi="Garamond" w:cs="Garamond"/>
+          <w:i/>
+          <w:iCs/>
+          <w:color w:val="6B7280"/>
+          <w:sz w:val="24"/>
+          <w:szCs w:val="24"/>
+        </w:rPr>
+        <w:t>_1и3</w:t>
+      </w:r>
+      <w:r>
+        <w:rPr>
+          <w:rFonts w:ascii="Garamond" w:eastAsia="Garamond" w:hAnsi="Garamond" w:cs="Garamond"/>
+          <w:color w:val="6B7280"/>
+          <w:sz w:val="24"/>
+          <w:szCs w:val="24"/>
+        </w:rPr>
+        <w:t>}}</w:t>
       </w:r>
     </w:p>
     <w:p>
@@ -2843,6 +3828,7 @@
           <w:sz w:val="24"/>
           <w:szCs w:val="24"/>
         </w:rPr>
+        <w:lastRenderedPageBreak/>
         <w:t xml:space="preserve">В. Геодезист:  </w:t>
       </w:r>
       <w:r>
@@ -2863,7 +3849,7 @@
           <w:sz w:val="24"/>
           <w:szCs w:val="24"/>
         </w:rPr>
-        <w:t>({{Геодезист_1и3}})</w:t>
+        <w:t>(инж.{{Геодезист_1и3}})</w:t>
       </w:r>
     </w:p>
     <w:p>
@@ -2880,27 +3866,44 @@
           <w:bottom w:val="single" w:sz="2" w:space="2" w:color="FDE8EC"/>
         </w:pBdr>
         <w:spacing w:before="200" w:after="80"/>
-      </w:pPr>
-      <w:r>
-        <w:rPr>
-          <w:rFonts w:ascii="Garamond" w:eastAsia="Garamond" w:hAnsi="Garamond" w:cs="Garamond"/>
+        <w:rPr>
           <w:b/>
           <w:bCs/>
-          <w:color w:val="E8647A"/>
-          <w:sz w:val="24"/>
-          <w:szCs w:val="24"/>
-        </w:rPr>
-        <w:t xml:space="preserve">3. Проверка при ниво корниз (стреха), кота {{Kota_Korniz}} </w:t>
-      </w:r>
+          <w:color w:val="FF0000"/>
+        </w:rPr>
+      </w:pPr>
       <w:r>
         <w:rPr>
           <w:rFonts w:ascii="Garamond" w:eastAsia="Garamond" w:hAnsi="Garamond" w:cs="Garamond"/>
           <w:b/>
           <w:bCs/>
-          <w:color w:val="E8647A"/>
-          <w:sz w:val="24"/>
-          <w:szCs w:val="24"/>
-        </w:rPr>
+          <w:color w:val="FF0000"/>
+          <w:sz w:val="24"/>
+          <w:szCs w:val="24"/>
+        </w:rPr>
+        <w:t xml:space="preserve">4. Проверка при ниво било, кота </w:t>
+      </w:r>
+      <w:r>
+        <w:rPr>
+          <w:rFonts w:ascii="Garamond" w:eastAsia="Garamond" w:hAnsi="Garamond" w:cs="Garamond"/>
+          <w:b/>
+          <w:bCs/>
+          <w:color w:val="FF0000"/>
+          <w:sz w:val="24"/>
+          <w:szCs w:val="24"/>
+        </w:rPr>
+        <w:t xml:space="preserve">{{Kota_Bilo}}  </w:t>
+      </w:r>
+      <w:r>
+        <w:rPr>
+          <w:rFonts w:ascii="Garamond" w:eastAsia="Garamond" w:hAnsi="Garamond" w:cs="Garamond"/>
+          <w:b/>
+          <w:bCs/>
+          <w:color w:val="FF0000"/>
+          <w:sz w:val="24"/>
+          <w:szCs w:val="24"/>
+        </w:rPr>
+        <w:t>м</w:t>
       </w:r>
     </w:p>
     <w:p>
@@ -2991,27 +3994,67 @@
           <w:sz w:val="24"/>
           <w:szCs w:val="24"/>
         </w:rPr>
-        <w:t>1. по част "Архитектура": {{ПЖ_Архитектура}}</w:t>
-      </w:r>
-    </w:p>
-    <w:p>
-      <w:pPr>
-        <w:spacing w:before="60" w:after="60"/>
-        <w:rPr>
-          <w:rFonts w:ascii="Garamond" w:eastAsia="Garamond" w:hAnsi="Garamond" w:cs="Garamond"/>
-          <w:color w:val="6B7280"/>
-          <w:sz w:val="24"/>
-          <w:szCs w:val="24"/>
-        </w:rPr>
-      </w:pPr>
-      <w:r>
-        <w:rPr>
-          <w:rFonts w:ascii="Garamond" w:eastAsia="Garamond" w:hAnsi="Garamond" w:cs="Garamond"/>
-          <w:color w:val="6B7280"/>
-          <w:sz w:val="24"/>
-          <w:szCs w:val="24"/>
-        </w:rPr>
-        <w:t xml:space="preserve">   2. по част "Конструктивна": {{ПЖ_Конструктивна}}</w:t>
+        <w:t xml:space="preserve">1. по част "Архитектура": </w:t>
+      </w:r>
+      <w:r>
+        <w:rPr>
+          <w:rFonts w:ascii="Garamond" w:eastAsia="Garamond" w:hAnsi="Garamond" w:cs="Garamond"/>
+          <w:i/>
+          <w:iCs/>
+          <w:color w:val="6B7280"/>
+          <w:sz w:val="24"/>
+          <w:szCs w:val="24"/>
+        </w:rPr>
+        <w:t>арх.</w:t>
+      </w:r>
+      <w:r>
+        <w:rPr>
+          <w:rFonts w:ascii="Garamond" w:eastAsia="Garamond" w:hAnsi="Garamond" w:cs="Garamond"/>
+          <w:color w:val="6B7280"/>
+          <w:sz w:val="24"/>
+          <w:szCs w:val="24"/>
+        </w:rPr>
+        <w:t>{{ПЖ_Архитектура}}</w:t>
+      </w:r>
+    </w:p>
+    <w:p>
+      <w:pPr>
+        <w:spacing w:before="60" w:after="60"/>
+        <w:rPr>
+          <w:rFonts w:ascii="Garamond" w:eastAsia="Garamond" w:hAnsi="Garamond" w:cs="Garamond"/>
+          <w:color w:val="6B7280"/>
+          <w:sz w:val="24"/>
+          <w:szCs w:val="24"/>
+        </w:rPr>
+      </w:pPr>
+      <w:r>
+        <w:rPr>
+          <w:rFonts w:ascii="Garamond" w:eastAsia="Garamond" w:hAnsi="Garamond" w:cs="Garamond"/>
+          <w:color w:val="6B7280"/>
+          <w:sz w:val="24"/>
+          <w:szCs w:val="24"/>
+        </w:rPr>
+        <w:t>2. по част "Конструктивна":</w:t>
+      </w:r>
+      <w:r>
+        <w:rPr>
+          <w:rFonts w:ascii="Garamond" w:eastAsia="Garamond" w:hAnsi="Garamond" w:cs="Garamond"/>
+          <w:i/>
+          <w:iCs/>
+          <w:color w:val="6B7280"/>
+          <w:sz w:val="24"/>
+          <w:szCs w:val="24"/>
+        </w:rPr>
+        <w:t>инж.</w:t>
+      </w:r>
+      <w:r>
+        <w:rPr>
+          <w:rFonts w:ascii="Garamond" w:eastAsia="Garamond" w:hAnsi="Garamond" w:cs="Garamond"/>
+          <w:color w:val="6B7280"/>
+          <w:sz w:val="24"/>
+          <w:szCs w:val="24"/>
+        </w:rPr>
+        <w:t xml:space="preserve"> {{ПЖ_Конструктивна}}</w:t>
       </w:r>
     </w:p>
     <w:p>
@@ -3040,23 +4083,25 @@
           <w:sz w:val="24"/>
           <w:szCs w:val="24"/>
         </w:rPr>
-        <w:t>след проверка на достигнатото ниво корниз с проектна кота {{Kota_Korniz}}  установих, че при изпълнението на СМР:</w:t>
-      </w:r>
-      <w:r>
-        <w:rPr>
-          <w:rFonts w:ascii="Garamond" w:eastAsia="Garamond" w:hAnsi="Garamond" w:cs="Garamond"/>
-          <w:color w:val="1F2937"/>
-          <w:sz w:val="24"/>
-          <w:szCs w:val="24"/>
-        </w:rPr>
-      </w:r>
-      <w:r>
-        <w:rPr>
-          <w:rFonts w:ascii="Garamond" w:eastAsia="Garamond" w:hAnsi="Garamond" w:cs="Garamond"/>
-          <w:color w:val="1F2937"/>
-          <w:sz w:val="24"/>
-          <w:szCs w:val="24"/>
-        </w:rPr>
+        <w:t xml:space="preserve">след проверка на достигнатото ниво </w:t>
+      </w:r>
+      <w:r>
+        <w:rPr>
+          <w:rFonts w:ascii="Garamond" w:eastAsia="Garamond" w:hAnsi="Garamond" w:cs="Garamond"/>
+          <w:color w:val="1F2937"/>
+          <w:sz w:val="24"/>
+          <w:szCs w:val="24"/>
+        </w:rPr>
+        <w:t>било</w:t>
+      </w:r>
+      <w:r>
+        <w:rPr>
+          <w:rFonts w:ascii="Garamond" w:eastAsia="Garamond" w:hAnsi="Garamond" w:cs="Garamond"/>
+          <w:color w:val="1F2937"/>
+          <w:sz w:val="24"/>
+          <w:szCs w:val="24"/>
+        </w:rPr>
+        <w:t xml:space="preserve"> с проектна кота {{Kota_Bilo}}  установих, че при изпълнението на СМР:</w:t>
       </w:r>
     </w:p>
     <w:p/>
@@ -3077,12 +4122,16 @@
     <w:p>
       <w:pPr>
         <w:spacing w:before="60" w:after="60"/>
-      </w:pPr>
-      <w:r>
-        <w:rPr>
-          <w:rFonts w:ascii="Garamond" w:eastAsia="Garamond" w:hAnsi="Garamond" w:cs="Garamond"/>
-          <w:i/>
-          <w:iCs/>
+        <w:rPr>
+          <w:strike/>
+        </w:rPr>
+      </w:pPr>
+      <w:r>
+        <w:rPr>
+          <w:rFonts w:ascii="Garamond" w:eastAsia="Garamond" w:hAnsi="Garamond" w:cs="Garamond"/>
+          <w:i/>
+          <w:iCs/>
+          <w:strike/>
           <w:color w:val="6B7280"/>
           <w:sz w:val="24"/>
           <w:szCs w:val="24"/>
@@ -3251,6 +4300,17 @@
     <w:p>
       <w:pPr>
         <w:spacing w:before="100" w:after="60"/>
+        <w:rPr>
+          <w:rFonts w:ascii="Garamond" w:eastAsia="Garamond" w:hAnsi="Garamond" w:cs="Garamond"/>
+          <w:color w:val="2D3561"/>
+          <w:sz w:val="24"/>
+          <w:szCs w:val="24"/>
+        </w:rPr>
+      </w:pPr>
+    </w:p>
+    <w:p>
+      <w:pPr>
+        <w:spacing w:before="100" w:after="60"/>
       </w:pPr>
       <w:r>
         <w:rPr>
@@ -3332,16 +4392,76 @@
           <w:sz w:val="24"/>
           <w:szCs w:val="24"/>
         </w:rPr>
+        <w:t>1</w:t>
+      </w:r>
+      <w:r>
+        <w:rPr>
+          <w:rFonts w:ascii="Garamond" w:eastAsia="Garamond" w:hAnsi="Garamond" w:cs="Garamond"/>
+          <w:color w:val="6B7280"/>
+          <w:sz w:val="24"/>
+          <w:szCs w:val="24"/>
+        </w:rPr>
         <w:t>1. ..............................</w:t>
       </w:r>
       <w:r>
         <w:rPr>
           <w:rFonts w:ascii="Garamond" w:eastAsia="Garamond" w:hAnsi="Garamond" w:cs="Garamond"/>
-          <w:color w:val="6B7280"/>
-          <w:sz w:val="24"/>
-          <w:szCs w:val="24"/>
-        </w:rPr>
-        <w:t xml:space="preserve">{{ПЖ_Архитектура}} </w:t>
+          <w:i/>
+          <w:iCs/>
+          <w:color w:val="6B7280"/>
+          <w:sz w:val="24"/>
+          <w:szCs w:val="24"/>
+        </w:rPr>
+        <w:t xml:space="preserve"> </w:t>
+      </w:r>
+      <w:r>
+        <w:rPr>
+          <w:rFonts w:ascii="Garamond" w:eastAsia="Garamond" w:hAnsi="Garamond" w:cs="Garamond"/>
+          <w:i/>
+          <w:iCs/>
+          <w:color w:val="6B7280"/>
+          <w:sz w:val="24"/>
+          <w:szCs w:val="24"/>
+        </w:rPr>
+        <w:t>арх.</w:t>
+      </w:r>
+      <w:r>
+        <w:rPr>
+          <w:rFonts w:ascii="Garamond" w:eastAsia="Garamond" w:hAnsi="Garamond" w:cs="Garamond"/>
+          <w:color w:val="6B7280"/>
+          <w:sz w:val="24"/>
+          <w:szCs w:val="24"/>
+        </w:rPr>
+        <w:t>{{ПЖ_Архитектура</w:t>
+      </w:r>
+      <w:r>
+        <w:rPr>
+          <w:rFonts w:ascii="Garamond" w:eastAsia="Garamond" w:hAnsi="Garamond" w:cs="Garamond"/>
+          <w:color w:val="6B7280"/>
+          <w:sz w:val="24"/>
+          <w:szCs w:val="24"/>
+        </w:rPr>
+        <w:t xml:space="preserve"> </w:t>
+      </w:r>
+      <w:r>
+        <w:rPr>
+          <w:rFonts w:ascii="Garamond" w:eastAsia="Garamond" w:hAnsi="Garamond" w:cs="Garamond"/>
+          <w:i/>
+          <w:iCs/>
+          <w:color w:val="6B7280"/>
+          <w:sz w:val="24"/>
+          <w:szCs w:val="24"/>
+        </w:rPr>
+        <w:t>_1и3</w:t>
+      </w:r>
+      <w:r>
+        <w:rPr>
+          <w:rFonts w:ascii="Garamond" w:eastAsia="Garamond" w:hAnsi="Garamond" w:cs="Garamond"/>
+          <w:color w:val="6B7280"/>
+          <w:sz w:val="24"/>
+          <w:szCs w:val="24"/>
+        </w:rPr>
+        <w:t xml:space="preserve">}} </w:t>
       </w:r>
     </w:p>
     <w:p>
@@ -3354,14 +4474,24 @@
           <w:szCs w:val="24"/>
         </w:rPr>
       </w:pPr>
-      <w:r>
-        <w:rPr>
-          <w:rFonts w:ascii="Garamond" w:eastAsia="Garamond" w:hAnsi="Garamond" w:cs="Garamond"/>
-          <w:color w:val="6B7280"/>
-          <w:sz w:val="24"/>
-          <w:szCs w:val="24"/>
-        </w:rPr>
-        <w:lastRenderedPageBreak/>
+    </w:p>
+    <w:p>
+      <w:pPr>
+        <w:spacing w:before="100" w:after="60"/>
+        <w:rPr>
+          <w:rFonts w:ascii="Garamond" w:eastAsia="Garamond" w:hAnsi="Garamond" w:cs="Garamond"/>
+          <w:color w:val="6B7280"/>
+          <w:sz w:val="24"/>
+          <w:szCs w:val="24"/>
+        </w:rPr>
+      </w:pPr>
+      <w:r>
+        <w:rPr>
+          <w:rFonts w:ascii="Garamond" w:eastAsia="Garamond" w:hAnsi="Garamond" w:cs="Garamond"/>
+          <w:color w:val="6B7280"/>
+          <w:sz w:val="24"/>
+          <w:szCs w:val="24"/>
+        </w:rPr>
         <w:t>2. .....................................</w:t>
       </w:r>
       <w:r>
@@ -3371,12 +4501,72 @@
           <w:sz w:val="24"/>
           <w:szCs w:val="24"/>
         </w:rPr>
-        <w:t xml:space="preserve"> {{ПЖ_Конструктивна}}</w:t>
+        <w:t xml:space="preserve"> </w:t>
+      </w:r>
+      <w:r>
+        <w:rPr>
+          <w:rFonts w:ascii="Garamond" w:eastAsia="Garamond" w:hAnsi="Garamond" w:cs="Garamond"/>
+          <w:i/>
+          <w:iCs/>
+          <w:color w:val="6B7280"/>
+          <w:sz w:val="24"/>
+          <w:szCs w:val="24"/>
+        </w:rPr>
+        <w:t>инж.</w:t>
+      </w:r>
+      <w:r>
+        <w:rPr>
+          <w:rFonts w:ascii="Garamond" w:eastAsia="Garamond" w:hAnsi="Garamond" w:cs="Garamond"/>
+          <w:color w:val="6B7280"/>
+          <w:sz w:val="24"/>
+          <w:szCs w:val="24"/>
+        </w:rPr>
+        <w:t>{{ПЖ_Конструктивна</w:t>
+      </w:r>
+      <w:r>
+        <w:rPr>
+          <w:rFonts w:ascii="Garamond" w:eastAsia="Garamond" w:hAnsi="Garamond" w:cs="Garamond"/>
+          <w:color w:val="6B7280"/>
+          <w:sz w:val="24"/>
+          <w:szCs w:val="24"/>
+        </w:rPr>
+        <w:t xml:space="preserve"> </w:t>
+      </w:r>
+      <w:r>
+        <w:rPr>
+          <w:rFonts w:ascii="Garamond" w:eastAsia="Garamond" w:hAnsi="Garamond" w:cs="Garamond"/>
+          <w:i/>
+          <w:iCs/>
+          <w:color w:val="6B7280"/>
+          <w:sz w:val="24"/>
+          <w:szCs w:val="24"/>
+        </w:rPr>
+        <w:t>_1и3</w:t>
+      </w:r>
+      <w:r>
+        <w:rPr>
+          <w:rFonts w:ascii="Garamond" w:eastAsia="Garamond" w:hAnsi="Garamond" w:cs="Garamond"/>
+          <w:color w:val="6B7280"/>
+          <w:sz w:val="24"/>
+          <w:szCs w:val="24"/>
+        </w:rPr>
+        <w:t>}}</w:t>
       </w:r>
     </w:p>
     <w:p>
       <w:pPr>
         <w:spacing w:before="100" w:after="60"/>
+        <w:rPr>
+          <w:rFonts w:ascii="Garamond" w:eastAsia="Garamond" w:hAnsi="Garamond" w:cs="Garamond"/>
+          <w:color w:val="6B7280"/>
+          <w:sz w:val="24"/>
+          <w:szCs w:val="24"/>
+        </w:rPr>
+      </w:pPr>
+    </w:p>
+    <w:p>
+      <w:pPr>
+        <w:spacing w:before="100" w:after="60"/>
       </w:pPr>
       <w:r>
         <w:rPr>
@@ -3405,586 +4595,19 @@
           <w:sz w:val="24"/>
           <w:szCs w:val="24"/>
         </w:rPr>
-        <w:t>({{Геодезист_1и3}})</w:t>
-      </w:r>
-    </w:p>
-    <w:p>
-      <w:pPr>
-        <w:pBdr>
-          <w:bottom w:val="single" w:sz="2" w:space="2" w:color="E5E7EB"/>
-        </w:pBdr>
-        <w:spacing w:before="120" w:after="120"/>
-      </w:pPr>
-    </w:p>
-    <w:p>
-      <w:pPr>
-        <w:pBdr>
-          <w:bottom w:val="single" w:sz="2" w:space="2" w:color="FDE8EC"/>
-        </w:pBdr>
-        <w:spacing w:before="200" w:after="80"/>
-      </w:pPr>
-      <w:r>
-        <w:rPr>
-          <w:rFonts w:ascii="Garamond" w:eastAsia="Garamond" w:hAnsi="Garamond" w:cs="Garamond"/>
-          <w:b/>
-          <w:bCs/>
-          <w:color w:val="E8647A"/>
-          <w:sz w:val="24"/>
-          <w:szCs w:val="24"/>
-        </w:rPr>
-        <w:t>4. Проверка при ниво било, кота ________________ м</w:t>
-      </w:r>
-    </w:p>
-    <w:p>
-      <w:pPr>
-        <w:spacing w:before="60" w:after="60"/>
-      </w:pPr>
-      <w:r>
-        <w:rPr>
-          <w:rFonts w:ascii="Garamond" w:eastAsia="Garamond" w:hAnsi="Garamond" w:cs="Garamond"/>
-          <w:color w:val="1F2937"/>
-          <w:sz w:val="24"/>
-          <w:szCs w:val="24"/>
-        </w:rPr>
-        <w:t>Днес, ...................................... г., долуподписаният:</w:t>
-      </w:r>
-    </w:p>
-    <w:p/>
-    <w:p>
-      <w:pPr>
-        <w:spacing w:before="60" w:after="60"/>
-      </w:pPr>
-      <w:r>
-        <w:rPr>
-          <w:rFonts w:ascii="Garamond" w:eastAsia="Garamond" w:hAnsi="Garamond" w:cs="Garamond"/>
-          <w:color w:val="1F2937"/>
-          <w:sz w:val="24"/>
-          <w:szCs w:val="24"/>
-        </w:rPr>
-        <w:t>А. Консултант (строителен надзор): инж. {{Управител_1и3}}, квалифицирано лице от списъка на {{Консултант_Фирма}}</w:t>
-      </w:r>
-    </w:p>
-    <w:p>
-      <w:pPr>
-        <w:spacing w:before="60" w:after="60"/>
-      </w:pPr>
-      <w:r>
-        <w:rPr>
-          <w:rFonts w:ascii="Garamond" w:eastAsia="Garamond" w:hAnsi="Garamond" w:cs="Garamond"/>
-          <w:color w:val="1F2937"/>
-          <w:sz w:val="24"/>
-          <w:szCs w:val="24"/>
-        </w:rPr>
-        <w:t>Технически ръководител: {{Строител_ТехРък}}</w:t>
-      </w:r>
-    </w:p>
-    <w:p>
-      <w:pPr>
-        <w:spacing w:before="60" w:after="60"/>
-      </w:pPr>
-      <w:r>
-        <w:rPr>
-          <w:rFonts w:ascii="Garamond" w:eastAsia="Garamond" w:hAnsi="Garamond" w:cs="Garamond"/>
-          <w:color w:val="1F2937"/>
-          <w:sz w:val="24"/>
-          <w:szCs w:val="24"/>
-        </w:rPr>
-        <w:t>В присъствието на:</w:t>
-      </w:r>
-    </w:p>
-    <w:p>
-      <w:pPr>
-        <w:spacing w:before="60" w:after="60"/>
-      </w:pPr>
-      <w:r>
-        <w:rPr>
-          <w:rFonts w:ascii="Garamond" w:eastAsia="Garamond" w:hAnsi="Garamond" w:cs="Garamond"/>
-          <w:color w:val="1F2937"/>
-          <w:sz w:val="24"/>
-          <w:szCs w:val="24"/>
-        </w:rPr>
-        <w:t>Б. Проектанти:</w:t>
-      </w:r>
-    </w:p>
-    <w:p>
-      <w:pPr>
-        <w:spacing w:before="60" w:after="60"/>
-        <w:rPr>
-          <w:rFonts w:ascii="Garamond" w:eastAsia="Garamond" w:hAnsi="Garamond" w:cs="Garamond"/>
-          <w:color w:val="6B7280"/>
-          <w:sz w:val="24"/>
-          <w:szCs w:val="24"/>
-        </w:rPr>
-      </w:pPr>
-      <w:r>
-        <w:rPr>
-          <w:rFonts w:ascii="Garamond" w:eastAsia="Garamond" w:hAnsi="Garamond" w:cs="Garamond"/>
-          <w:color w:val="6B7280"/>
-          <w:sz w:val="24"/>
-          <w:szCs w:val="24"/>
-        </w:rPr>
-        <w:t>1. по част "Архитектура": {{ПЖ_Архитектура}}</w:t>
-      </w:r>
-    </w:p>
-    <w:p>
-      <w:pPr>
-        <w:spacing w:before="60" w:after="60"/>
-        <w:rPr>
-          <w:rFonts w:ascii="Garamond" w:eastAsia="Garamond" w:hAnsi="Garamond" w:cs="Garamond"/>
-          <w:color w:val="6B7280"/>
-          <w:sz w:val="24"/>
-          <w:szCs w:val="24"/>
-        </w:rPr>
-      </w:pPr>
-      <w:r>
-        <w:rPr>
-          <w:rFonts w:ascii="Garamond" w:eastAsia="Garamond" w:hAnsi="Garamond" w:cs="Garamond"/>
-          <w:color w:val="6B7280"/>
-          <w:sz w:val="24"/>
-          <w:szCs w:val="24"/>
-        </w:rPr>
-        <w:t xml:space="preserve">   2. по част "Конструктивна": {{ПЖ_Конструктивна}}</w:t>
-      </w:r>
-    </w:p>
-    <w:p>
-      <w:pPr>
-        <w:spacing w:before="60" w:after="60"/>
-      </w:pPr>
-      <w:r>
-        <w:rPr>
-          <w:rFonts w:ascii="Garamond" w:eastAsia="Garamond" w:hAnsi="Garamond" w:cs="Garamond"/>
-          <w:color w:val="1F2937"/>
-          <w:sz w:val="24"/>
-          <w:szCs w:val="24"/>
-        </w:rPr>
-        <w:t>В. Техническото правоспособно физическо лице по Геодезия: {{Геодезист}}</w:t>
-      </w:r>
-    </w:p>
-    <w:p/>
-    <w:p>
-      <w:pPr>
-        <w:spacing w:before="60" w:after="60"/>
-      </w:pPr>
-      <w:r>
-        <w:rPr>
-          <w:rFonts w:ascii="Garamond" w:eastAsia="Garamond" w:hAnsi="Garamond" w:cs="Garamond"/>
-          <w:color w:val="1F2937"/>
-          <w:sz w:val="24"/>
-          <w:szCs w:val="24"/>
-        </w:rPr>
-        <w:t>след проверка на достигнатото ниво bilo с проектна кота {{Kota_Bilo}}  установих, че при изпълнението на СМР:</w:t>
-      </w:r>
-      <w:r>
-        <w:rPr>
-          <w:rFonts w:ascii="Garamond" w:eastAsia="Garamond" w:hAnsi="Garamond" w:cs="Garamond"/>
-          <w:color w:val="1F2937"/>
-          <w:sz w:val="24"/>
-          <w:szCs w:val="24"/>
-        </w:rPr>
-      </w:r>
-      <w:r>
-        <w:rPr>
-          <w:rFonts w:ascii="Garamond" w:eastAsia="Garamond" w:hAnsi="Garamond" w:cs="Garamond"/>
-          <w:color w:val="1F2937"/>
-          <w:sz w:val="24"/>
-          <w:szCs w:val="24"/>
-        </w:rPr>
-      </w:r>
-    </w:p>
-    <w:p/>
-    <w:p>
-      <w:pPr>
-        <w:spacing w:before="60" w:after="60"/>
-      </w:pPr>
-      <w:r>
-        <w:rPr>
-          <w:rFonts w:ascii="Garamond" w:eastAsia="Garamond" w:hAnsi="Garamond" w:cs="Garamond"/>
-          <w:color w:val="1F2937"/>
-          <w:sz w:val="24"/>
-          <w:szCs w:val="24"/>
-        </w:rPr>
-        <w:t>а) отговарят на предвидените по проект и издадените строителни книжа;</w:t>
-      </w:r>
-    </w:p>
-    <w:p>
-      <w:pPr>
-        <w:spacing w:before="60" w:after="60"/>
-      </w:pPr>
-      <w:r>
-        <w:rPr>
-          <w:rFonts w:ascii="Garamond" w:eastAsia="Garamond" w:hAnsi="Garamond" w:cs="Garamond"/>
-          <w:i/>
-          <w:iCs/>
-          <w:color w:val="6B7280"/>
-          <w:sz w:val="24"/>
-          <w:szCs w:val="24"/>
-        </w:rPr>
-        <w:t>б) не отговарят на одобрения проект, като отклонения са констатирани при:</w:t>
-      </w:r>
-    </w:p>
-    <w:p>
-      <w:pPr>
-        <w:spacing w:before="60" w:after="60"/>
-      </w:pPr>
-      <w:r>
-        <w:rPr>
-          <w:rFonts w:ascii="Garamond" w:eastAsia="Garamond" w:hAnsi="Garamond" w:cs="Garamond"/>
-          <w:color w:val="9CA3AF"/>
-          <w:sz w:val="24"/>
-          <w:szCs w:val="24"/>
-        </w:rPr>
-        <w:t>.................................................................................................................................................................</w:t>
-      </w:r>
-    </w:p>
-    <w:p>
-      <w:pPr>
-        <w:spacing w:before="60" w:after="60"/>
-      </w:pPr>
-      <w:r>
-        <w:rPr>
-          <w:rFonts w:ascii="Garamond" w:eastAsia="Garamond" w:hAnsi="Garamond" w:cs="Garamond"/>
-          <w:i/>
-          <w:iCs/>
-          <w:color w:val="6B7280"/>
-          <w:sz w:val="24"/>
-          <w:szCs w:val="24"/>
-        </w:rPr>
-        <w:t>(описват се подробно констатираните отклонения)</w:t>
-      </w:r>
-    </w:p>
-    <w:p/>
-    <w:p>
-      <w:pPr>
-        <w:spacing w:before="60" w:after="60"/>
-      </w:pPr>
-      <w:r>
-        <w:rPr>
-          <w:rFonts w:ascii="Garamond" w:eastAsia="Garamond" w:hAnsi="Garamond" w:cs="Garamond"/>
-          <w:color w:val="1F2937"/>
-          <w:sz w:val="24"/>
-          <w:szCs w:val="24"/>
-        </w:rPr>
-        <w:t>Предвидените в плана за безопасност и здраве мерки са изпълнени (не са изпълнени):</w:t>
-      </w:r>
-    </w:p>
-    <w:p>
-      <w:pPr>
-        <w:spacing w:before="60" w:after="60"/>
-      </w:pPr>
-      <w:r>
-        <w:rPr>
-          <w:rFonts w:ascii="Garamond" w:eastAsia="Garamond" w:hAnsi="Garamond" w:cs="Garamond"/>
-          <w:color w:val="9CA3AF"/>
-          <w:sz w:val="24"/>
-          <w:szCs w:val="24"/>
-        </w:rPr>
-        <w:t>.................................................................................................................................................................</w:t>
-      </w:r>
-    </w:p>
-    <w:p/>
-    <w:p>
-      <w:pPr>
-        <w:spacing w:before="60" w:after="60"/>
-      </w:pPr>
-      <w:r>
-        <w:rPr>
-          <w:rFonts w:ascii="Garamond" w:eastAsia="Garamond" w:hAnsi="Garamond" w:cs="Garamond"/>
-          <w:color w:val="2D3561"/>
-          <w:sz w:val="24"/>
-          <w:szCs w:val="24"/>
-        </w:rPr>
-        <w:t xml:space="preserve">Разрешавам изпълнението на следващите СМР: </w:t>
-      </w:r>
-      <w:r>
-        <w:rPr>
-          <w:rFonts w:ascii="Garamond" w:eastAsia="Garamond" w:hAnsi="Garamond" w:cs="Garamond"/>
-          <w:color w:val="9CA3AF"/>
-          <w:sz w:val="24"/>
-          <w:szCs w:val="24"/>
-        </w:rPr>
-        <w:t>.................................................................................................</w:t>
-      </w:r>
-    </w:p>
-    <w:p>
-      <w:pPr>
-        <w:spacing w:before="60" w:after="60"/>
-      </w:pPr>
-      <w:r>
-        <w:rPr>
-          <w:rFonts w:ascii="Garamond" w:eastAsia="Garamond" w:hAnsi="Garamond" w:cs="Garamond"/>
-          <w:color w:val="9CA3AF"/>
-          <w:sz w:val="24"/>
-          <w:szCs w:val="24"/>
-        </w:rPr>
-        <w:t>.................................................................................................................................................................</w:t>
-      </w:r>
-    </w:p>
-    <w:p>
-      <w:pPr>
-        <w:pBdr>
-          <w:bottom w:val="single" w:sz="2" w:space="2" w:color="E5E7EB"/>
-        </w:pBdr>
-        <w:spacing w:before="120" w:after="120"/>
-      </w:pPr>
-    </w:p>
-    <w:p>
-      <w:pPr>
-        <w:pBdr>
-          <w:bottom w:val="single" w:sz="2" w:space="2" w:color="FDE8EC"/>
-        </w:pBdr>
-        <w:spacing w:before="200" w:after="80"/>
-      </w:pPr>
-      <w:r>
-        <w:rPr>
-          <w:rFonts w:ascii="Garamond" w:eastAsia="Garamond" w:hAnsi="Garamond" w:cs="Garamond"/>
-          <w:b/>
-          <w:bCs/>
-          <w:color w:val="E8647A"/>
-          <w:sz w:val="24"/>
-          <w:szCs w:val="24"/>
-        </w:rPr>
-        <w:t>Извършил проверката:</w:t>
+        <w:t>(инж.{{Геодезист_1и3}})</w:t>
       </w:r>
     </w:p>
     <w:p>
       <w:pPr>
         <w:spacing w:before="100" w:after="60"/>
-      </w:pPr>
-      <w:r>
-        <w:rPr>
-          <w:rFonts w:ascii="Garamond" w:eastAsia="Garamond" w:hAnsi="Garamond" w:cs="Garamond"/>
-          <w:color w:val="2D3561"/>
-          <w:sz w:val="24"/>
-          <w:szCs w:val="24"/>
-        </w:rPr>
-        <w:t xml:space="preserve">А. Консултант:  </w:t>
-      </w:r>
-      <w:r>
-        <w:rPr>
-          <w:rFonts w:ascii="Garamond" w:eastAsia="Garamond" w:hAnsi="Garamond" w:cs="Garamond"/>
-          <w:color w:val="9CA3AF"/>
-          <w:sz w:val="24"/>
-          <w:szCs w:val="24"/>
-        </w:rPr>
-        <w:t xml:space="preserve">..............................   </w:t>
-      </w:r>
-      <w:r>
-        <w:rPr>
-          <w:rFonts w:ascii="Garamond" w:eastAsia="Garamond" w:hAnsi="Garamond" w:cs="Garamond"/>
-          <w:i/>
-          <w:iCs/>
-          <w:color w:val="6B7280"/>
-          <w:sz w:val="24"/>
-          <w:szCs w:val="24"/>
-        </w:rPr>
-        <w:t>(инж. {{Управител_1и3}})</w:t>
-      </w:r>
-    </w:p>
-    <w:p>
-      <w:pPr>
-        <w:spacing w:before="100" w:after="60"/>
-        <w:rPr>
-          <w:rFonts w:ascii="Garamond" w:eastAsia="Garamond" w:hAnsi="Garamond" w:cs="Garamond"/>
-          <w:color w:val="2D3561"/>
-          <w:sz w:val="24"/>
-          <w:szCs w:val="24"/>
-        </w:rPr>
-      </w:pPr>
-    </w:p>
-    <w:p>
-      <w:pPr>
-        <w:spacing w:before="100" w:after="60"/>
-      </w:pPr>
-      <w:r>
-        <w:rPr>
-          <w:rFonts w:ascii="Garamond" w:eastAsia="Garamond" w:hAnsi="Garamond" w:cs="Garamond"/>
-          <w:color w:val="2D3561"/>
-          <w:sz w:val="24"/>
-          <w:szCs w:val="24"/>
-        </w:rPr>
-        <w:t xml:space="preserve">Техн. ръководител:  </w:t>
-      </w:r>
-      <w:r>
-        <w:rPr>
-          <w:rFonts w:ascii="Garamond" w:eastAsia="Garamond" w:hAnsi="Garamond" w:cs="Garamond"/>
-          <w:color w:val="9CA3AF"/>
-          <w:sz w:val="24"/>
-          <w:szCs w:val="24"/>
-        </w:rPr>
-        <w:t xml:space="preserve">..............................   </w:t>
-      </w:r>
-      <w:r>
-        <w:rPr>
-          <w:rFonts w:ascii="Garamond" w:eastAsia="Garamond" w:hAnsi="Garamond" w:cs="Garamond"/>
-          <w:i/>
-          <w:iCs/>
-          <w:color w:val="6B7280"/>
-          <w:sz w:val="24"/>
-          <w:szCs w:val="24"/>
-        </w:rPr>
-        <w:t>({{ТехРък_1и3}})</w:t>
-      </w:r>
-    </w:p>
-    <w:p>
-      <w:pPr>
-        <w:pBdr>
-          <w:bottom w:val="single" w:sz="2" w:space="2" w:color="FDE8EC"/>
-        </w:pBdr>
-        <w:spacing w:before="200" w:after="80"/>
-      </w:pPr>
-      <w:r>
-        <w:rPr>
-          <w:rFonts w:ascii="Garamond" w:eastAsia="Garamond" w:hAnsi="Garamond" w:cs="Garamond"/>
-          <w:b/>
-          <w:bCs/>
-          <w:color w:val="E8647A"/>
-          <w:sz w:val="24"/>
-          <w:szCs w:val="24"/>
-        </w:rPr>
-        <w:t>Присъствали:</w:t>
-      </w:r>
-    </w:p>
-    <w:p>
-      <w:pPr>
-        <w:spacing w:before="60" w:after="60"/>
-      </w:pPr>
-      <w:r>
-        <w:rPr>
-          <w:rFonts w:ascii="Garamond" w:eastAsia="Garamond" w:hAnsi="Garamond" w:cs="Garamond"/>
-          <w:color w:val="1F2937"/>
-          <w:sz w:val="24"/>
-          <w:szCs w:val="24"/>
-        </w:rPr>
-        <w:t>Б. Проектанти:</w:t>
-      </w:r>
-    </w:p>
-    <w:p>
-      <w:pPr>
-        <w:spacing w:before="100" w:after="60"/>
-        <w:rPr>
-          <w:rFonts w:ascii="Garamond" w:eastAsia="Garamond" w:hAnsi="Garamond" w:cs="Garamond"/>
-          <w:color w:val="6B7280"/>
-          <w:sz w:val="24"/>
-          <w:szCs w:val="24"/>
-        </w:rPr>
-      </w:pPr>
-      <w:r>
-        <w:rPr>
-          <w:rFonts w:ascii="Garamond" w:eastAsia="Garamond" w:hAnsi="Garamond" w:cs="Garamond"/>
-          <w:color w:val="6B7280"/>
-          <w:sz w:val="24"/>
-          <w:szCs w:val="24"/>
-        </w:rPr>
-        <w:t>1. ..............................</w:t>
-      </w:r>
-      <w:r>
-        <w:rPr>
-          <w:rFonts w:ascii="Garamond" w:eastAsia="Garamond" w:hAnsi="Garamond" w:cs="Garamond"/>
-          <w:color w:val="6B7280"/>
-          <w:sz w:val="24"/>
-          <w:szCs w:val="24"/>
-        </w:rPr>
-        <w:t xml:space="preserve">{{ПЖ_Архитектура}} </w:t>
-      </w:r>
-    </w:p>
-    <w:p>
-      <w:pPr>
-        <w:spacing w:before="100" w:after="60"/>
-        <w:rPr>
-          <w:rFonts w:ascii="Garamond" w:eastAsia="Garamond" w:hAnsi="Garamond" w:cs="Garamond"/>
-          <w:color w:val="6B7280"/>
-          <w:sz w:val="24"/>
-          <w:szCs w:val="24"/>
-        </w:rPr>
-      </w:pPr>
-    </w:p>
-    <w:p>
-      <w:pPr>
-        <w:spacing w:before="100" w:after="60"/>
-        <w:rPr>
-          <w:rFonts w:ascii="Garamond" w:eastAsia="Garamond" w:hAnsi="Garamond" w:cs="Garamond"/>
-          <w:color w:val="6B7280"/>
-          <w:sz w:val="24"/>
-          <w:szCs w:val="24"/>
-        </w:rPr>
-      </w:pPr>
-      <w:r>
-        <w:rPr>
-          <w:rFonts w:ascii="Garamond" w:eastAsia="Garamond" w:hAnsi="Garamond" w:cs="Garamond"/>
-          <w:color w:val="6B7280"/>
-          <w:sz w:val="24"/>
-          <w:szCs w:val="24"/>
-        </w:rPr>
-        <w:t>2. .....................................</w:t>
-      </w:r>
-      <w:r>
-        <w:rPr>
-          <w:rFonts w:ascii="Garamond" w:eastAsia="Garamond" w:hAnsi="Garamond" w:cs="Garamond"/>
-          <w:color w:val="6B7280"/>
-          <w:sz w:val="24"/>
-          <w:szCs w:val="24"/>
-        </w:rPr>
-        <w:t xml:space="preserve"> {{ПЖ_Конструктивна}}</w:t>
-      </w:r>
-    </w:p>
-    <w:p>
-      <w:pPr>
-        <w:spacing w:before="100" w:after="60"/>
-        <w:rPr>
-          <w:rFonts w:ascii="Garamond" w:eastAsia="Garamond" w:hAnsi="Garamond" w:cs="Garamond"/>
-          <w:color w:val="2D3561"/>
-          <w:sz w:val="24"/>
-          <w:szCs w:val="24"/>
-        </w:rPr>
-      </w:pPr>
-    </w:p>
-    <w:p>
-      <w:pPr>
-        <w:spacing w:before="100" w:after="60"/>
-      </w:pPr>
-      <w:r>
-        <w:rPr>
-          <w:rFonts w:ascii="Garamond" w:eastAsia="Garamond" w:hAnsi="Garamond" w:cs="Garamond"/>
-          <w:color w:val="2D3561"/>
-          <w:sz w:val="24"/>
-          <w:szCs w:val="24"/>
-        </w:rPr>
-        <w:t xml:space="preserve">В. Геодезист:  </w:t>
-      </w:r>
-      <w:r>
-        <w:rPr>
-          <w:rFonts w:ascii="Garamond" w:eastAsia="Garamond" w:hAnsi="Garamond" w:cs="Garamond"/>
-          <w:color w:val="9CA3AF"/>
-          <w:sz w:val="24"/>
-          <w:szCs w:val="24"/>
-        </w:rPr>
-        <w:t xml:space="preserve">..............................   </w:t>
-      </w:r>
-      <w:r>
-        <w:rPr>
-          <w:rFonts w:ascii="Garamond" w:eastAsia="Garamond" w:hAnsi="Garamond" w:cs="Garamond"/>
-          <w:i/>
-          <w:iCs/>
-          <w:color w:val="6B7280"/>
-          <w:sz w:val="24"/>
-          <w:szCs w:val="24"/>
-        </w:rPr>
-        <w:t>({{Геодезист_1и3}})</w:t>
-      </w:r>
-    </w:p>
-    <w:p>
-      <w:pPr>
-        <w:pBdr>
-          <w:bottom w:val="single" w:sz="2" w:space="2" w:color="E5E7EB"/>
-        </w:pBdr>
-        <w:spacing w:before="120" w:after="120"/>
       </w:pPr>
     </w:p>
     <w:sectPr>
       <w:headerReference w:type="default" r:id="rId7"/>
       <w:footerReference w:type="default" r:id="rId8"/>
       <w:pgSz w:w="11906" w:h="16838"/>
-      <w:pgMar w:top="1134" w:right="566" w:bottom="1134" w:left="1701" w:header="708" w:footer="708" w:gutter="0"/>
+      <w:pgMar w:top="993" w:right="566" w:bottom="1134" w:left="1701" w:header="284" w:footer="246" w:gutter="0"/>
       <w:cols w:space="708"/>
       <w:docGrid w:linePitch="360"/>
     </w:sectPr>
@@ -4721,7 +5344,7 @@
   <w:style w:type="paragraph" w:default="1" w:styleId="Normal">
     <w:name w:val="Normal"/>
     <w:qFormat/>
-    <w:rsid w:val="00C85792"/>
+    <w:rsid w:val="00DC580B"/>
   </w:style>
   <w:style w:type="paragraph" w:styleId="Heading1">
     <w:name w:val="heading 1"/>
@@ -4900,6 +5523,48 @@
       <w:sz w:val="20"/>
       <w:szCs w:val="20"/>
     </w:rPr>
+  </w:style>
+  <w:style w:type="paragraph" w:styleId="Header">
+    <w:name w:val="header"/>
+    <w:basedOn w:val="Normal"/>
+    <w:link w:val="HeaderChar"/>
+    <w:uiPriority w:val="99"/>
+    <w:unhideWhenUsed/>
+    <w:rsid w:val="00DC580B"/>
+    <w:pPr>
+      <w:tabs>
+        <w:tab w:val="center" w:pos="4536"/>
+        <w:tab w:val="right" w:pos="9072"/>
+      </w:tabs>
+    </w:pPr>
+  </w:style>
+  <w:style w:type="character" w:customStyle="1" w:styleId="HeaderChar">
+    <w:name w:val="Header Char"/>
+    <w:basedOn w:val="DefaultParagraphFont"/>
+    <w:link w:val="Header"/>
+    <w:uiPriority w:val="99"/>
+    <w:rsid w:val="00DC580B"/>
+  </w:style>
+  <w:style w:type="paragraph" w:styleId="Footer">
+    <w:name w:val="footer"/>
+    <w:basedOn w:val="Normal"/>
+    <w:link w:val="FooterChar"/>
+    <w:uiPriority w:val="99"/>
+    <w:unhideWhenUsed/>
+    <w:rsid w:val="00DC580B"/>
+    <w:pPr>
+      <w:tabs>
+        <w:tab w:val="center" w:pos="4536"/>
+        <w:tab w:val="right" w:pos="9072"/>
+      </w:tabs>
+    </w:pPr>
+  </w:style>
+  <w:style w:type="character" w:customStyle="1" w:styleId="FooterChar">
+    <w:name w:val="Footer Char"/>
+    <w:basedOn w:val="DefaultParagraphFont"/>
+    <w:link w:val="Footer"/>
+    <w:uiPriority w:val="99"/>
+    <w:rsid w:val="00DC580B"/>
   </w:style>
 </w:styles>
 </file>

</xml_diff>

<commit_message>
Fix: remove stray run causing 11. instead of 1. in Protokol 2 bilo section (para 196)
Co-Authored-By: Claude Sonnet 4.6 <noreply@anthropic.com>
</commit_message>
<xml_diff>
--- a/templates/Protokol_2_Combined_Template.docx
+++ b/templates/Protokol_2_Combined_Template.docx
@@ -4385,15 +4385,6 @@
           <w:szCs w:val="24"/>
         </w:rPr>
       </w:pPr>
-      <w:r>
-        <w:rPr>
-          <w:rFonts w:ascii="Garamond" w:eastAsia="Garamond" w:hAnsi="Garamond" w:cs="Garamond"/>
-          <w:color w:val="6B7280"/>
-          <w:sz w:val="24"/>
-          <w:szCs w:val="24"/>
-        </w:rPr>
-        <w:t>1</w:t>
-      </w:r>
       <w:r>
         <w:rPr>
           <w:rFonts w:ascii="Garamond" w:eastAsia="Garamond" w:hAnsi="Garamond" w:cs="Garamond"/>

</xml_diff>

<commit_message>
feat(vazlogitel): N реда с точки за подписи — build_vazlogitel_podpisva_redove + шаблон
</commit_message>
<xml_diff>
--- a/templates/Protokol_2_Combined_Template.docx
+++ b/templates/Protokol_2_Combined_Template.docx
@@ -763,8 +763,6 @@
         </w:rPr>
         <w:t xml:space="preserve"> </w:t>
       </w:r>
-      <w:bookmarkStart w:id="0" w:name="_GoBack"/>
-      <w:bookmarkEnd w:id="0"/>
       <w:r>
         <w:rPr>
           <w:rFonts w:ascii="Garamond" w:eastAsia="Garamond" w:hAnsi="Garamond" w:cs="Garamond"/>
@@ -1078,7 +1076,7 @@
           <w:sz w:val="24"/>
           <w:szCs w:val="24"/>
         </w:rPr>
-        <w:t xml:space="preserve">Б.:  </w:t>
+        <w:t>Б.:  ..............................   ({{Възложател_Подписва_Редове}})</w:t>
       </w:r>
       <w:r>
         <w:rPr>
@@ -1087,18 +1085,16 @@
           <w:sz w:val="24"/>
           <w:szCs w:val="24"/>
         </w:rPr>
-        <w:t xml:space="preserve">..............................   </w:t>
-      </w:r>
-      <w:r>
-        <w:rPr>
-          <w:rFonts w:ascii="Garamond" w:eastAsia="Garamond" w:hAnsi="Garamond" w:cs="Garamond"/>
-          <w:i/>
-          <w:iCs/>
-          <w:color w:val="6B7280"/>
-          <w:sz w:val="24"/>
-          <w:szCs w:val="24"/>
-        </w:rPr>
-        <w:t>({{Възложител_1и3}})</w:t>
+      </w:r>
+      <w:r>
+        <w:rPr>
+          <w:rFonts w:ascii="Garamond" w:eastAsia="Garamond" w:hAnsi="Garamond" w:cs="Garamond"/>
+          <w:i/>
+          <w:iCs/>
+          <w:color w:val="6B7280"/>
+          <w:sz w:val="24"/>
+          <w:szCs w:val="24"/>
+        </w:rPr>
       </w:r>
     </w:p>
     <w:p>
@@ -1588,7 +1584,7 @@
           <w:sz w:val="24"/>
           <w:szCs w:val="24"/>
         </w:rPr>
-        <w:t xml:space="preserve">Б.:  </w:t>
+        <w:t>Б.:  ..............................   ({{Възложател_Подписва_Редове}})</w:t>
       </w:r>
       <w:r>
         <w:rPr>
@@ -1597,18 +1593,16 @@
           <w:sz w:val="24"/>
           <w:szCs w:val="24"/>
         </w:rPr>
-        <w:t xml:space="preserve">..............................   </w:t>
-      </w:r>
-      <w:r>
-        <w:rPr>
-          <w:rFonts w:ascii="Garamond" w:eastAsia="Garamond" w:hAnsi="Garamond" w:cs="Garamond"/>
-          <w:i/>
-          <w:iCs/>
-          <w:color w:val="6B7280"/>
-          <w:sz w:val="24"/>
-          <w:szCs w:val="24"/>
-        </w:rPr>
-        <w:t>({{Възложител_1и3}})</w:t>
+      </w:r>
+      <w:r>
+        <w:rPr>
+          <w:rFonts w:ascii="Garamond" w:eastAsia="Garamond" w:hAnsi="Garamond" w:cs="Garamond"/>
+          <w:i/>
+          <w:iCs/>
+          <w:color w:val="6B7280"/>
+          <w:sz w:val="24"/>
+          <w:szCs w:val="24"/>
+        </w:rPr>
       </w:r>
     </w:p>
     <w:p>
@@ -2345,7 +2339,18 @@
           <w:sz w:val="24"/>
           <w:szCs w:val="24"/>
         </w:rPr>
-        <w:t xml:space="preserve">}}  </w:t>
+        <w:t>}}</w:t>
+      </w:r>
+      <w:bookmarkStart w:id="0" w:name="_GoBack"/>
+      <w:bookmarkEnd w:id="0"/>
+      <w:r>
+        <w:rPr>
+          <w:rFonts w:ascii="Garamond" w:eastAsia="Garamond" w:hAnsi="Garamond" w:cs="Garamond"/>
+          <w:color w:val="6B7280"/>
+          <w:sz w:val="24"/>
+          <w:szCs w:val="24"/>
+        </w:rPr>
+        <w:t xml:space="preserve"> </w:t>
       </w:r>
     </w:p>
     <w:p>
@@ -4678,7 +4683,7 @@
         <w:sz w:val="18"/>
         <w:szCs w:val="18"/>
       </w:rPr>
-      <w:t>6</w:t>
+      <w:t>2</w:t>
     </w:r>
     <w:r>
       <w:rPr>

</xml_diff>